<commit_message>
DM manuscript: restore depth removed in condensation (fuller lit review + positioning table, expanded managerial section, class profiles, synthesis) 4136->5618 words
</commit_message>
<xml_diff>
--- a/outputs/submitted/manuscrit_DM.docx
+++ b/outputs/submitted/manuscrit_DM.docx
@@ -232,6 +232,14 @@
         <w:pStyle w:val="BodyText"/>
       </w:pPr>
       <w:r>
+        <w:t xml:space="preserve">L’enjeu n’est pas mince pour les acteurs. Le développement des circuits courts figure aujourd’hui parmi les objectifs affichés des politiques alimentaires territoriales, des chambres d’agriculture et d’une partie de la grande distribution, qui multiplie les rayons de producteurs. Tous partagent une même interrogation pratique : comment faire grandir une pratique qui suscite une adhésion de principe très large mais peine à se traduire dans les paniers ? Répondre suppose de savoir où, précisément, se situe le point de blocage — dans le recrutement de nouveaux acheteurs, ou dans la fidélisation de ceux qui essaient déjà.</w:t>
+      </w:r>
+    </w:p>
+    <w:p>
+      <w:pPr>
+        <w:pStyle w:val="BodyText"/>
+      </w:pPr>
+      <w:r>
         <w:t xml:space="preserve">La recherche a abondamment documenté deux faces du phénomène : les</w:t>
       </w:r>
       <w:r>
@@ -430,7 +438,23 @@
         <w:pStyle w:val="FirstParagraph"/>
       </w:pPr>
       <w:r>
-        <w:t xml:space="preserve">En France, la définition administrative des circuits courts retient la présence d’au plus un intermédiaire entre le producteur et le consommateur (Ministère de l’Agriculture et de l’Alimentation, 2009). La vente directe en est le sous-ensemble le plus strict — l’achat sans intermédiaire — et recouvre une pluralité de dispositifs partageant une même caractéristique : la relation directe au producteur, porteuse d’un supplément de sens et d’information (Dubuisson-Quellier et al., 2011).</w:t>
+        <w:t xml:space="preserve">En France, la définition administrative des circuits courts retient la présence d’au plus un intermédiaire entre le producteur et le consommateur (Ministère de l’Agriculture et de l’Alimentation, 2009). La vente directe en est le sous-ensemble le plus strict — l’achat sans intermédiaire — et recouvre une pluralité de dispositifs : vente à la ferme, marchés où le producteur vend lui-même, magasins de producteurs, associations pour le maintien d’une agriculture paysanne (AMAP), paniers en précommande (Chiffoleau, 2019 ; Maréchal, 2008). Tous partagent une même caractéristique : la relation directe au producteur, porteuse d’un supplément de sens et d’information sur le produit (Dubuisson-Quellier et al., 2011 ; Lamine et Perrot, 2008). À l’échelle européenne, l’état des lieux socio-économique de Kneafsey et al. (2013) souligne l’hétérogénéité de ces dispositifs et, surtout, la faiblesse persistante des données représentatives sur leur diffusion réelle auprès des ménages — un déficit que la présente enquête vise à combler. La littérature sur les réseaux alimentaires alternatifs insiste par ailleurs sur la</w:t>
+      </w:r>
+      <w:r>
+        <w:t xml:space="preserve"> </w:t>
+      </w:r>
+      <w:r>
+        <w:rPr>
+          <w:b/>
+          <w:bCs/>
+        </w:rPr>
+        <w:t xml:space="preserve">coexistence</w:t>
+      </w:r>
+      <w:r>
+        <w:t xml:space="preserve"> </w:t>
+      </w:r>
+      <w:r>
+        <w:t xml:space="preserve">plutôt que la rupture entre circuits : loin de se substituer à la grande distribution, la vente directe s’y articule (Goodman et DuPuis, 2002 ; Sage, 2003).</w:t>
       </w:r>
     </w:p>
     <w:p>
@@ -454,20 +478,52 @@
         <w:t xml:space="preserve"> </w:t>
       </w:r>
       <w:r>
-        <w:t xml:space="preserve">pour des fonctions distinctes (Neslin et al., 2006). Le passage du multicanal à l’</w:t>
+        <w:t xml:space="preserve">pour des fonctions distinctes, ce qui pose des enjeux spécifiques de coordination et d’allocation entre points de vente (Neslin et al., 2006). Le passage du</w:t>
+      </w:r>
+      <w:r>
+        <w:t xml:space="preserve"> </w:t>
+      </w:r>
+      <w:r>
+        <w:rPr>
+          <w:i/>
+          <w:iCs/>
+        </w:rPr>
+        <w:t xml:space="preserve">multicanal</w:t>
+      </w:r>
+      <w:r>
+        <w:t xml:space="preserve"> </w:t>
+      </w:r>
+      <w:r>
+        <w:t xml:space="preserve">à l’</w:t>
+      </w:r>
+      <w:r>
+        <w:rPr>
+          <w:i/>
+          <w:iCs/>
+        </w:rPr>
+        <w:t xml:space="preserve">omnicanal</w:t>
+      </w:r>
+      <w:r>
+        <w:t xml:space="preserve"> </w:t>
+      </w:r>
+      <w:r>
+        <w:t xml:space="preserve">(Verhoef et al., 2015) a ensuite déplacé l’attention de la simple juxtaposition des canaux vers leur</w:t>
+      </w:r>
+      <w:r>
+        <w:t xml:space="preserve"> </w:t>
       </w:r>
       <w:r>
         <w:rPr>
           <w:b/>
           <w:bCs/>
         </w:rPr>
-        <w:t xml:space="preserve">omnicanal</w:t>
+        <w:t xml:space="preserve">intégration</w:t>
       </w:r>
       <w:r>
         <w:t xml:space="preserve"> </w:t>
       </w:r>
       <w:r>
-        <w:t xml:space="preserve">(Verhoef et al., 2015) a déplacé l’attention de la juxtaposition des canaux vers leur intégration dans un parcours d’achat unifié, où le consommateur arbitre en continu selon le produit, le moment et le contexte. En France, les travaux sur le</w:t>
+        <w:t xml:space="preserve">dans un parcours d’achat unifié, où le consommateur arbitre en continu entre points de vente selon le produit, le moment et le contexte. En France, les travaux sur le</w:t>
       </w:r>
       <w:r>
         <w:t xml:space="preserve"> </w:t>
@@ -483,7 +539,28 @@
         <w:t xml:space="preserve"> </w:t>
       </w:r>
       <w:r>
-        <w:t xml:space="preserve">et la valeur du magasinage (Filser et Plichon, 2004 ; Volle, 2012) avaient déjà documenté cette pluralité des fréquentations. Transposé aux circuits courts, ce cadre suggère que la vente directe n’entre pas en concurrence frontale avec la grande distribution : elle</w:t>
+        <w:t xml:space="preserve">et la valeur du magasinage (Filser et Plichon, 2004 ; Volle, 2012) avaient déjà documenté cette pluralité des fréquentations : le ménage gère de fait un</w:t>
+      </w:r>
+      <w:r>
+        <w:t xml:space="preserve"> </w:t>
+      </w:r>
+      <w:r>
+        <w:rPr>
+          <w:b/>
+          <w:bCs/>
+        </w:rPr>
+        <w:t xml:space="preserve">portefeuille de canaux</w:t>
+      </w:r>
+      <w:r>
+        <w:t xml:space="preserve">, mobilisés pour des fonctions différentes — l’hypermarché pour le gros des courses et les prix, l’artisan pour la qualité de certains produits, le marché pour le frais et le plaisir.</w:t>
+      </w:r>
+    </w:p>
+    <w:p>
+      <w:pPr>
+        <w:pStyle w:val="BodyText"/>
+      </w:pPr>
+      <w:r>
+        <w:t xml:space="preserve">Transposé aux circuits courts, ce cadre suggère que la vente directe n’entre pas en concurrence frontale avec la grande distribution : elle</w:t>
       </w:r>
       <w:r>
         <w:t xml:space="preserve"> </w:t>
@@ -499,7 +576,7 @@
         <w:t xml:space="preserve"> </w:t>
       </w:r>
       <w:r>
-        <w:t xml:space="preserve">dans le portefeuille. La question pertinente n’est alors plus « pourquoi acheter en vente directe ? » mais « quelle part et quelle fonction la vente directe occupe-t-elle dans le portefeuille du ménage ? ».</w:t>
+        <w:t xml:space="preserve">dans le portefeuille — typiquement l’approvisionnement de certaines catégories (légumes, œufs, fromages, viande) valorisées pour leur fraîcheur ou leur origine. La question pertinente n’est alors plus « pourquoi acheter en vente directe ? » mais « quelle part et quelle fonction la vente directe occupe-t-elle dans le portefeuille du ménage ? ». À notre connaissance, l’application explicite du cadre omnicanal à l’alimentation directe et locale reste inédite : c’est le premier déplacement de l’article.</w:t>
       </w:r>
     </w:p>
     <w:bookmarkEnd w:id="14"/>
@@ -517,7 +594,18 @@
         <w:pStyle w:val="FirstParagraph"/>
       </w:pPr>
       <w:r>
-        <w:t xml:space="preserve">La littérature sur la consommation durable a massivement documenté les motivations d’achat en circuit court, en mobilisant notamment la théorie du comportement planifié et le rôle de la confiance (Giampietri et al., 2016 ; Giampietri et al., 2018). Elle a aussi identifié une limite récurrente : l’</w:t>
+        <w:t xml:space="preserve">La littérature sur la consommation alimentaire durable a massivement documenté les motivations d’achat en circuit court — qualité et fraîcheur perçues, confiance dans le producteur, soutien à l’économie locale, préoccupation environnementale et éthique (Dubuisson-Quellier et al., 2011 ; Birch et al., 2018). Plusieurs travaux mobilisent la théorie du comportement planifié pour relier attitudes, normes et intentions à l’achat, en insistant sur le rôle central de la confiance envers le producteur (Giampietri et al., 2016 ; Giampietri et al., 2018). Birch et al. (2018) montrent en outre que, chez le « consommateur attentif », les motivations égoïstes (goût, santé, sécurité) pèsent souvent davantage que les motivations altruistes (soutien, environnement).</w:t>
+      </w:r>
+    </w:p>
+    <w:p>
+      <w:pPr>
+        <w:pStyle w:val="BodyText"/>
+      </w:pPr>
+      <w:r>
+        <w:t xml:space="preserve">Ces recherches partagent toutefois une limite bien identifiée : le fameux</w:t>
+      </w:r>
+      <w:r>
+        <w:t xml:space="preserve"> </w:t>
       </w:r>
       <w:r>
         <w:rPr>
@@ -527,15 +615,62 @@
         <w:t xml:space="preserve">écart entre attitude et comportement</w:t>
       </w:r>
       <w:r>
-        <w:t xml:space="preserve">, des attitudes très favorables ne se traduisant pas mécaniquement en achats (Vermeir et Verbeke, 2006). La revue de Feldmann et Hamm (2015) précise que, contrairement au bio, l’alimentation locale n’est pas d’abord perçue comme chère : les principaux freins sont l’inconvénience et le manque de disponibilité — des obstacles pratiques plus que financiers.</w:t>
-      </w:r>
-    </w:p>
-    <w:p>
-      <w:pPr>
-        <w:pStyle w:val="BodyText"/>
-      </w:pPr>
-      <w:r>
-        <w:t xml:space="preserve">Or la plupart de ces travaux mesurent des intentions ou un consentement à payer hypothétique. La méta-analyse de Mustapa et Kallas (2025) estime ainsi à +34,5 % la prime que les consommateurs se déclarent prêts à payer pour un produit de circuit court — un chiffre à confronter à la part de budget réellement consacrée. Nous choisissons de mesurer cette allocation effective : combien, concrètement, le ménage consacre-t-il à la vente directe, et non combien il dit vouloir y consacrer.</w:t>
+        <w:t xml:space="preserve"> </w:t>
+      </w:r>
+      <w:r>
+        <w:t xml:space="preserve">(</w:t>
+      </w:r>
+      <w:r>
+        <w:rPr>
+          <w:i/>
+          <w:iCs/>
+        </w:rPr>
+        <w:t xml:space="preserve">attitude-behaviour gap</w:t>
+      </w:r>
+      <w:r>
+        <w:t xml:space="preserve">), selon lequel des attitudes très favorables ne se traduisent pas mécaniquement en achats effectifs (Vermeir et Verbeke, 2006). La revue de Feldmann et Hamm (2015), portant sur soixante-treize études, précise d’ailleurs que, contrairement au bio, l’alimentation locale n’est pas d’abord perçue comme chère : les principaux freins sont l’</w:t>
+      </w:r>
+      <w:r>
+        <w:rPr>
+          <w:b/>
+          <w:bCs/>
+        </w:rPr>
+        <w:t xml:space="preserve">inconvénience</w:t>
+      </w:r>
+      <w:r>
+        <w:t xml:space="preserve"> </w:t>
+      </w:r>
+      <w:r>
+        <w:t xml:space="preserve">et le</w:t>
+      </w:r>
+      <w:r>
+        <w:t xml:space="preserve"> </w:t>
+      </w:r>
+      <w:r>
+        <w:rPr>
+          <w:b/>
+          <w:bCs/>
+        </w:rPr>
+        <w:t xml:space="preserve">manque de disponibilité</w:t>
+      </w:r>
+      <w:r>
+        <w:t xml:space="preserve"> </w:t>
+      </w:r>
+      <w:r>
+        <w:t xml:space="preserve">— soit des obstacles pratiques plus que financiers. Or la plupart de ces travaux mesurent des intentions, des attitudes ou un consentement à payer hypothétique, rarement des comportements d’achat effectifs. La méta-analyse de Mustapa et Kallas (2025) estime ainsi à +34,5 % la prime moyenne que les consommateurs se déclarent prêts à payer pour un produit de circuit court — un chiffre à confronter à la part de budget réellement consacrée. Le deuxième déplacement de l’article consiste précisément à quitter le registre déclaratif pour mesurer l’</w:t>
+      </w:r>
+      <w:r>
+        <w:rPr>
+          <w:b/>
+          <w:bCs/>
+        </w:rPr>
+        <w:t xml:space="preserve">allocation budgétaire réelle</w:t>
+      </w:r>
+      <w:r>
+        <w:t xml:space="preserve"> </w:t>
+      </w:r>
+      <w:r>
+        <w:t xml:space="preserve">entre canaux : combien, concrètement, le ménage consacre-t-il à la vente directe, et non combien il dit vouloir y consacrer.</w:t>
       </w:r>
     </w:p>
     <w:bookmarkEnd w:id="15"/>
@@ -553,7 +688,39 @@
         <w:pStyle w:val="FirstParagraph"/>
       </w:pPr>
       <w:r>
-        <w:t xml:space="preserve">Segmenter les consommateurs de circuits courts se fait le plus souvent sur des attitudes ou des variables sociodémographiques (Feldmann et Hamm, 2015). La revue systématique de Herzig et Zander (2025) conclut cependant que ces variables expliquent finalement peu le comportement, au profit de facteurs contextuels et relationnels. Nous proposons une segmentation d’une autre nature, fondée sur le</w:t>
+        <w:t xml:space="preserve">Un troisième courant cherche à</w:t>
+      </w:r>
+      <w:r>
+        <w:t xml:space="preserve"> </w:t>
+      </w:r>
+      <w:r>
+        <w:rPr>
+          <w:b/>
+          <w:bCs/>
+        </w:rPr>
+        <w:t xml:space="preserve">segmenter</w:t>
+      </w:r>
+      <w:r>
+        <w:t xml:space="preserve"> </w:t>
+      </w:r>
+      <w:r>
+        <w:t xml:space="preserve">les consommateurs de produits locaux ou de circuits courts. Les revues récentes montrent que cette segmentation s’appuie le plus souvent sur des attitudes, des motivations ou des variables sociodémographiques (Feldmann et Hamm, 2015). La revue systématique de Herzig et Zander (2025) conclut cependant que ces variables sociodémographiques, bien que fréquemment étudiées, expliquent finalement peu le comportement, au profit de facteurs contextuels, informationnels et relationnels ; la méta-analyse de Mustapa et Kallas (2025) relève de son côté des effets hétérogènes du genre, de l’âge, de l’éducation et de la région sur le consentement à payer. Ces approches segmentent donc les individus par leurs</w:t>
+      </w:r>
+      <w:r>
+        <w:t xml:space="preserve"> </w:t>
+      </w:r>
+      <w:r>
+        <w:rPr>
+          <w:b/>
+          <w:bCs/>
+        </w:rPr>
+        <w:t xml:space="preserve">dispositions</w:t>
+      </w:r>
+      <w:r>
+        <w:t xml:space="preserve"> </w:t>
+      </w:r>
+      <w:r>
+        <w:t xml:space="preserve">déclarées. Nous proposons une segmentation d’une autre nature, fondée non sur des attitudes mais sur le</w:t>
       </w:r>
       <w:r>
         <w:t xml:space="preserve"> </w:t>
@@ -569,7 +736,7 @@
         <w:t xml:space="preserve"> </w:t>
       </w:r>
       <w:r>
-        <w:t xml:space="preserve">: elle classe les ménages selon</w:t>
+        <w:t xml:space="preserve">et l’allocation réelle de budget qui en résulte : elle classe les ménages selon</w:t>
       </w:r>
       <w:r>
         <w:t xml:space="preserve"> </w:t>
@@ -598,9 +765,220 @@
         <w:t xml:space="preserve">ce qu’ils déclarent penser</w:t>
       </w:r>
       <w:r>
-        <w:t xml:space="preserve">.</w:t>
+        <w:t xml:space="preserve">. C’est le troisième déplacement de l’article.</w:t>
       </w:r>
     </w:p>
+    <w:p>
+      <w:pPr>
+        <w:pStyle w:val="BodyText"/>
+      </w:pPr>
+      <w:r>
+        <w:t xml:space="preserve">Ce positionnement (Tableau 1) conduit à trois attentes, que l’analyse met à l’épreuve. D’abord, la vente directe occuperait rarement la place de canal principal : diffusion potentiellement large, mais part de budget faible (complémentarité, non substitution). Ensuite, sa pratique serait faiblement déterminée par le profil sociodémographique : elle traverserait les catégories. Enfin, conformément à l’écart attitude-comportement, l’adhésion déclarée serait nettement plus forte que le poids budgétaire effectif — beaucoup l’essaieraient, peu l’installeraient.</w:t>
+      </w:r>
+    </w:p>
+    <w:p>
+      <w:pPr>
+        <w:pStyle w:val="BodyText"/>
+      </w:pPr>
+      <w:r>
+        <w:rPr>
+          <w:b/>
+          <w:bCs/>
+        </w:rPr>
+        <w:t xml:space="preserve">Tableau 1 : Positionnement de l’article</w:t>
+      </w:r>
+    </w:p>
+    <w:tbl>
+      <w:tblPr>
+        <w:tblStyle w:val="Table"/>
+        <w:tblW w:type="pct" w:w="5000"/>
+        <w:tblLayout w:type="fixed"/>
+        <w:tblLook w:firstRow="1" w:lastRow="0" w:firstColumn="0" w:lastColumn="0" w:noHBand="0" w:noVBand="0" w:val="0020"/>
+      </w:tblPr>
+      <w:tblGrid>
+        <w:gridCol w:w="2227"/>
+        <w:gridCol w:w="2970"/>
+        <w:gridCol w:w="2722"/>
+      </w:tblGrid>
+      <w:tr>
+        <w:trPr>
+          <w:tblHeader w:val="on"/>
+        </w:trPr>
+        <w:tc>
+          <w:tcPr/>
+          <w:p>
+            <w:pPr>
+              <w:pStyle w:val="Compact"/>
+            </w:pPr>
+            <w:r>
+              <w:t xml:space="preserve">Courant mobilisé</w:t>
+            </w:r>
+          </w:p>
+        </w:tc>
+        <w:tc>
+          <w:tcPr/>
+          <w:p>
+            <w:pPr>
+              <w:pStyle w:val="Compact"/>
+            </w:pPr>
+            <w:r>
+              <w:t xml:space="preserve">Références principales</w:t>
+            </w:r>
+          </w:p>
+        </w:tc>
+        <w:tc>
+          <w:tcPr/>
+          <w:p>
+            <w:pPr>
+              <w:pStyle w:val="Compact"/>
+            </w:pPr>
+            <w:r>
+              <w:t xml:space="preserve">Déplacement proposé</w:t>
+            </w:r>
+          </w:p>
+        </w:tc>
+      </w:tr>
+      <w:tr>
+        <w:tc>
+          <w:tcPr/>
+          <w:p>
+            <w:pPr>
+              <w:pStyle w:val="Compact"/>
+            </w:pPr>
+            <w:r>
+              <w:t xml:space="preserve">Comportement omnicanal</w:t>
+            </w:r>
+          </w:p>
+        </w:tc>
+        <w:tc>
+          <w:tcPr/>
+          <w:p>
+            <w:pPr>
+              <w:pStyle w:val="Compact"/>
+            </w:pPr>
+            <w:r>
+              <w:t xml:space="preserve">Neslin et al. (2006) ; Verhoef et al. (2015)</w:t>
+            </w:r>
+          </w:p>
+        </w:tc>
+        <w:tc>
+          <w:tcPr/>
+          <w:p>
+            <w:pPr>
+              <w:pStyle w:val="Compact"/>
+            </w:pPr>
+            <w:r>
+              <w:t xml:space="preserve">Application inédite à l’alimentation locale et directe</w:t>
+            </w:r>
+          </w:p>
+        </w:tc>
+      </w:tr>
+      <w:tr>
+        <w:tc>
+          <w:tcPr/>
+          <w:p>
+            <w:pPr>
+              <w:pStyle w:val="Compact"/>
+            </w:pPr>
+            <w:r>
+              <w:t xml:space="preserve">Consommation durable</w:t>
+            </w:r>
+          </w:p>
+        </w:tc>
+        <w:tc>
+          <w:tcPr/>
+          <w:p>
+            <w:pPr>
+              <w:pStyle w:val="Compact"/>
+            </w:pPr>
+            <w:r>
+              <w:t xml:space="preserve">Vermeir et Verbeke (2006) ; Giampietri et al. (2016, 2018) ; Birch et al. (2018)</w:t>
+            </w:r>
+          </w:p>
+        </w:tc>
+        <w:tc>
+          <w:tcPr/>
+          <w:p>
+            <w:pPr>
+              <w:pStyle w:val="Compact"/>
+            </w:pPr>
+            <w:r>
+              <w:t xml:space="preserve">Du déclaratif à l’allocation budgétaire réelle</w:t>
+            </w:r>
+          </w:p>
+        </w:tc>
+      </w:tr>
+      <w:tr>
+        <w:tc>
+          <w:tcPr/>
+          <w:p>
+            <w:pPr>
+              <w:pStyle w:val="Compact"/>
+            </w:pPr>
+            <w:r>
+              <w:t xml:space="preserve">Segmentation</w:t>
+            </w:r>
+          </w:p>
+        </w:tc>
+        <w:tc>
+          <w:tcPr/>
+          <w:p>
+            <w:pPr>
+              <w:pStyle w:val="Compact"/>
+            </w:pPr>
+            <w:r>
+              <w:t xml:space="preserve">Feldmann et Hamm (2015) ; Herzig et Zander (2025) ; Mustapa et Kallas (2025)</w:t>
+            </w:r>
+          </w:p>
+        </w:tc>
+        <w:tc>
+          <w:tcPr/>
+          <w:p>
+            <w:pPr>
+              <w:pStyle w:val="Compact"/>
+            </w:pPr>
+            <w:r>
+              <w:t xml:space="preserve">Segmentation par le portefeuille de canaux et le budget réel</w:t>
+            </w:r>
+          </w:p>
+        </w:tc>
+      </w:tr>
+      <w:tr>
+        <w:tc>
+          <w:tcPr/>
+          <w:p>
+            <w:pPr>
+              <w:pStyle w:val="Compact"/>
+            </w:pPr>
+            <w:r>
+              <w:t xml:space="preserve">Circuits courts (UE/France)</w:t>
+            </w:r>
+          </w:p>
+        </w:tc>
+        <w:tc>
+          <w:tcPr/>
+          <w:p>
+            <w:pPr>
+              <w:pStyle w:val="Compact"/>
+            </w:pPr>
+            <w:r>
+              <w:t xml:space="preserve">Kneafsey et al. (2013) ; Chiffoleau (2019) ; Praly et al. (2014)</w:t>
+            </w:r>
+          </w:p>
+        </w:tc>
+        <w:tc>
+          <w:tcPr/>
+          <w:p>
+            <w:pPr>
+              <w:pStyle w:val="Compact"/>
+            </w:pPr>
+            <w:r>
+              <w:t xml:space="preserve">Mesure représentative nationale, côté ménage</w:t>
+            </w:r>
+          </w:p>
+        </w:tc>
+      </w:tr>
+    </w:tbl>
     <w:bookmarkEnd w:id="16"/>
     <w:bookmarkEnd w:id="17"/>
     <w:bookmarkStart w:id="18" w:name="X7145b3f0329b27779053ada1e4c2ef6847806d6"/>
@@ -862,7 +1240,23 @@
         <w:t xml:space="preserve"> </w:t>
       </w:r>
       <w:r>
-        <w:t xml:space="preserve">d’approvisionnement différents. La hiérarchie est nette (Figure 1, Tableau 1) : l’hypermarché-supermarché domine sans partage (99,1 % de pénétration, 58,5 % du budget), suivi du hard discount (15,6 % du budget), des artisans et commerçants spécialisés (7,6 %) et du marché (4,8 %). Les canaux de circuits courts proprement dits ne pèsent qu’à la marge dans le budget.</w:t>
+        <w:t xml:space="preserve">d’approvisionnement différents : la pluralité des fréquentations, postulée par le cadre omnicanal, est ici pleinement confirmée. La hiérarchie est nette (Figure 1, Tableau 2) : l’hypermarché-supermarché domine sans partage (99,1 % de pénétration, 58,5 % du budget), suivi du hard discount (15,6 % du budget), des artisans et commerçants spécialisés (7,6 %) et du marché (4,8 %). Les canaux de circuits courts proprement dits ne pèsent qu’à la marge dans le budget. L’ensemble dessine une structure en</w:t>
+      </w:r>
+      <w:r>
+        <w:t xml:space="preserve"> </w:t>
+      </w:r>
+      <w:r>
+        <w:rPr>
+          <w:b/>
+          <w:bCs/>
+        </w:rPr>
+        <w:t xml:space="preserve">noyau et périphérie</w:t>
+      </w:r>
+      <w:r>
+        <w:t xml:space="preserve"> </w:t>
+      </w:r>
+      <w:r>
+        <w:t xml:space="preserve">: un noyau — grande distribution et discount — qui concentre près des trois quarts du budget, et une périphérie de canaux spécialisés, dont la vente directe, fréquentés par beaucoup mais pour de faibles montants. C’est dans cette périphérie, et non en rivalité avec le noyau, que se joue la vente directe.</w:t>
       </w:r>
     </w:p>
     <w:p>
@@ -953,7 +1347,7 @@
         <w:t xml:space="preserve"> </w:t>
       </w:r>
       <w:r>
-        <w:t xml:space="preserve">pratiquent une forme de vente directe. L’achat direct aux agriculteurs (hors marchés) concerne 49,7 % des ménages, mais seulement 17,3 % de façon régulière (Figure 2) ; l’achat direct au producteur sur les marchés ajoute 157 ménages qui n’auraient pas été comptés autrement.</w:t>
+        <w:t xml:space="preserve">pratiquent une forme de vente directe. L’achat direct aux agriculteurs (hors marchés) concerne 49,7 % des ménages, mais seulement 17,3 % de façon régulière (Figure 2) ; l’achat direct au producteur sur les marchés ajoute 157 ménages — un quart de la population concernée — qui n’auraient pas été comptés autrement. Reconnaître cette seconde porte importe : réduire la vente directe à ses formes les plus institutionnalisées (AMAP, magasins de producteurs) en sous-estimerait nettement la diffusion, en ignorant le marché, premier lieu de contact direct avec les agriculteurs.</w:t>
       </w:r>
     </w:p>
     <w:p>
@@ -965,7 +1359,7 @@
           <w:b/>
           <w:bCs/>
         </w:rPr>
-        <w:t xml:space="preserve">Tableau 1 : Pénétration et part de budget des principaux canaux (n = 1 025)</w:t>
+        <w:t xml:space="preserve">Tableau 2 : Pénétration et part de budget des principaux canaux (n = 1 025)</w:t>
       </w:r>
     </w:p>
     <w:tbl>
@@ -1495,7 +1889,7 @@
         <w:pStyle w:val="FirstParagraph"/>
       </w:pPr>
       <w:r>
-        <w:t xml:space="preserve">La typologie fait émerger cinq stratégies distinctes (Figure 3, Tableau 2), que l’examen conjoint de la pénétration et de l’usage régulier permet de caractériser. La lecture des deux mesures de vente directe — inclusive (au moins un achat) et régulière (au moins mensuel) — est essentielle, car un taux inclusif élevé peut recouvrir un simple essai.</w:t>
+        <w:t xml:space="preserve">La typologie fait émerger cinq stratégies distinctes (Figure 3, Tableau 3), que l’examen conjoint de la pénétration et de l’usage régulier permet de caractériser. La lecture des deux mesures de vente directe — inclusive (au moins un achat) et régulière (au moins mensuel) — est essentielle, car un taux inclusif élevé peut recouvrir un simple essai.</w:t>
       </w:r>
     </w:p>
     <w:p>
@@ -1574,7 +1968,7 @@
           <w:b/>
           <w:bCs/>
         </w:rPr>
-        <w:t xml:space="preserve">Tableau 2 : Les cinq stratégies d’approvisionnement</w:t>
+        <w:t xml:space="preserve">Tableau 3 : Les cinq stratégies d’approvisionnement</w:t>
       </w:r>
     </w:p>
     <w:tbl>
@@ -2092,6 +2486,62 @@
         <w:t xml:space="preserve">(2,5 %), les seuls à ne pas recourir régulièrement à la grande distribution, s’appuient sur le marché et la proximité, avec le budget le plus modeste : ce profil, marginal en effectif, montre qu’un approvisionnement structurellement périphérique à la grande distribution existe, et qu’il n’est pas le fait des ménages les plus aisés.</w:t>
       </w:r>
     </w:p>
+    <w:p>
+      <w:pPr>
+        <w:pStyle w:val="BodyText"/>
+      </w:pPr>
+      <w:r>
+        <w:t xml:space="preserve">Deux enseignements transversaux ressortent de cette typologie. Le premier est que la distinction entre</w:t>
+      </w:r>
+      <w:r>
+        <w:t xml:space="preserve"> </w:t>
+      </w:r>
+      <w:r>
+        <w:rPr>
+          <w:b/>
+          <w:bCs/>
+        </w:rPr>
+        <w:t xml:space="preserve">essai</w:t>
+      </w:r>
+      <w:r>
+        <w:t xml:space="preserve"> </w:t>
+      </w:r>
+      <w:r>
+        <w:t xml:space="preserve">et</w:t>
+      </w:r>
+      <w:r>
+        <w:t xml:space="preserve"> </w:t>
+      </w:r>
+      <w:r>
+        <w:rPr>
+          <w:b/>
+          <w:bCs/>
+        </w:rPr>
+        <w:t xml:space="preserve">usage installé</w:t>
+      </w:r>
+      <w:r>
+        <w:t xml:space="preserve"> </w:t>
+      </w:r>
+      <w:r>
+        <w:t xml:space="preserve">— qu’illustre l’écart entre vente directe inclusive et régulière — structure l’ensemble : le taux inclusif de vente directe croît avec l’ampleur du répertoire de canaux (de 28 % chez les captifs à 100 % chez les multi-canal conventionnels), mais l’usage régulier ne culmine que chez les omnivores engagés (67 %), montrant que largeur du répertoire et intensité d’engagement ne se confondent pas. Le second est que ce n’est pas le profil social qui prédit le mieux la vente directe, mais la</w:t>
+      </w:r>
+      <w:r>
+        <w:t xml:space="preserve"> </w:t>
+      </w:r>
+      <w:r>
+        <w:rPr>
+          <w:b/>
+          <w:bCs/>
+        </w:rPr>
+        <w:t xml:space="preserve">configuration d’usage</w:t>
+      </w:r>
+      <w:r>
+        <w:t xml:space="preserve"> </w:t>
+      </w:r>
+      <w:r>
+        <w:t xml:space="preserve">— la stratégie d’approvisionnement — dans laquelle elle s’inscrit : les omnivores l’installent dans une routine multi-canal dense, les captifs s’en tiennent à distance, les multi-canal conventionnels l’essaient sans la pérenniser. Cette grille de segmentation par les pratiques est directement actionnable, car chaque configuration appelle un levier différent.</w:t>
+      </w:r>
+    </w:p>
     <w:bookmarkEnd w:id="29"/>
     <w:bookmarkStart w:id="36" w:name="X7f871b1800f415beac489a6ed1e968c0967dae2"/>
     <w:p>
@@ -2107,7 +2557,15 @@
         <w:pStyle w:val="FirstParagraph"/>
       </w:pPr>
       <w:r>
-        <w:t xml:space="preserve">La régression logistique du recours à la vente directe (Figure 4) explique très peu de sa variance (pseudo-R² de McFadden = 0,022). Deux effets seulement ressortent nettement : appartenir aux cadres et professions libérales multiplie par 2,16 les chances de pratiquer la vente directe (p = 0,003), et un budget alimentaire élevé l’accroît modérément (odds-ratio = 1,18 par écart-type, p = 0,028) ; les professions intermédiaires sont également au-dessus de la référence (odds-ratio = 1,60, p = 0,027). En revanche, le sexe, l’âge et la taille d’agglomération n’ont pas d’effet significatif.</w:t>
+        <w:t xml:space="preserve">Les cinq stratégies diffèrent significativement par la catégorie socioprofessionnelle (p &lt; 0,001) et par l’âge (p = 0,005). Les omnivores engagés et les multi-canal conventionnels sur-représentent les cadres et les professions intermédiaires et disposent des budgets les plus élevés ; les captifs de la grande distribution et les généralistes reflètent davantage la structure moyenne de la population ; le groupe hors-hypermarché se distingue par sa part élevée de retraités et son budget réduit. Ces écarts, réels, restent toutefois modestes au regard de la dispersion interne des classes.</w:t>
+      </w:r>
+    </w:p>
+    <w:p>
+      <w:pPr>
+        <w:pStyle w:val="BodyText"/>
+      </w:pPr>
+      <w:r>
+        <w:t xml:space="preserve">La régression logistique du recours à la vente directe (Figure 4) le confirme : le modèle explique très peu de sa variance (pseudo-R² de McFadden = 0,022). Deux effets seulement ressortent nettement : appartenir aux cadres et professions libérales multiplie par 2,16 les chances de pratiquer la vente directe (p = 0,003), et un budget alimentaire élevé l’accroît modérément (odds-ratio = 1,18 par écart-type, p = 0,028) ; les professions intermédiaires sont également au-dessus de la référence (odds-ratio = 1,60, p = 0,027). En revanche, le sexe, l’âge et la taille d’agglomération n’ont pas d’effet significatif.</w:t>
       </w:r>
     </w:p>
     <w:p>
@@ -2275,7 +2733,23 @@
         <w:pStyle w:val="FirstParagraph"/>
       </w:pPr>
       <w:r>
-        <w:t xml:space="preserve">Ces résultats déplacent le diagnostic habituel et appellent des recommandations concrètes (Encadré 3).</w:t>
+        <w:t xml:space="preserve">Ces résultats déplacent le diagnostic habituel. Tant que la vente directe est pensée comme une pratique de niche à diffuser, l’effort porte naturellement sur la sensibilisation et la conquête de nouveaux convaincus. Or nos données montrent que la conquête est, pour l’essentiel, déjà faite : deux ménages sur trois ont franchi le pas de l’achat direct. Le problème n’est pas d’ouvrir le canal à de nouveaux publics, mais de le</w:t>
+      </w:r>
+      <w:r>
+        <w:t xml:space="preserve"> </w:t>
+      </w:r>
+      <w:r>
+        <w:rPr>
+          <w:b/>
+          <w:bCs/>
+        </w:rPr>
+        <w:t xml:space="preserve">rendre régulier</w:t>
+      </w:r>
+      <w:r>
+        <w:t xml:space="preserve"> </w:t>
+      </w:r>
+      <w:r>
+        <w:t xml:space="preserve">chez ceux qui l’ont déjà essayé. Cette bascule de diagnostic — de l’acquisition vers la fidélisation, du convaincre vers le faciliter — structure quatre recommandations (Encadré 3), adressées prioritairement aux producteurs et réseaux de vente directe et aux collectivités.</w:t>
       </w:r>
     </w:p>
     <w:p>
@@ -2293,17 +2767,39 @@
         <w:t xml:space="preserve"> </w:t>
       </w:r>
       <w:r>
-        <w:t xml:space="preserve">Le potentiel de conquête est largement atteint : 65 % des ménages ont déjà acheté en direct. Le véritable levier de croissance n’est donc pas de « convertir » de nouveaux publics, mais de faire passer les ménages de l’</w:t>
+        <w:t xml:space="preserve">Le potentiel de conquête est largement atteint : 65 % des ménages ont déjà acheté en direct, mais seuls 17 % le font régulièrement, et un seul groupe sur cinq — les omnivores engagés — a vraiment installé la pratique. Le gisement de croissance se situe donc chez les quelque 48 % de ménages qui achètent en direct</w:t>
+      </w:r>
+      <w:r>
+        <w:t xml:space="preserve"> </w:t>
       </w:r>
       <w:r>
         <w:rPr>
           <w:b/>
           <w:bCs/>
         </w:rPr>
-        <w:t xml:space="preserve">essai occasionnel à l’usage installé</w:t>
-      </w:r>
-      <w:r>
-        <w:t xml:space="preserve">. Un seul groupe sur cinq — les omnivores engagés — a vraiment franchi ce pas. Pour les producteurs et les réseaux de vente directe, cela oriente l’effort vers les dispositifs de régularité : abonnements et paniers récurrents, points de retrait sur les trajets domicile-travail, élargissement des gammes pour couvrir une plus grande part du panier, animation de la relation client.</w:t>
+        <w:t xml:space="preserve">sans régularité</w:t>
+      </w:r>
+      <w:r>
+        <w:t xml:space="preserve"> </w:t>
+      </w:r>
+      <w:r>
+        <w:t xml:space="preserve">: les faire passer de l’essai à l’habitude produirait un effet budgétaire bien supérieur à celui du recrutement de nouveaux essayeurs. Pour les producteurs et les réseaux de vente directe, cela oriente l’effort vers les</w:t>
+      </w:r>
+      <w:r>
+        <w:t xml:space="preserve"> </w:t>
+      </w:r>
+      <w:r>
+        <w:rPr>
+          <w:b/>
+          <w:bCs/>
+        </w:rPr>
+        <w:t xml:space="preserve">dispositifs de régularité</w:t>
+      </w:r>
+      <w:r>
+        <w:t xml:space="preserve"> </w:t>
+      </w:r>
+      <w:r>
+        <w:t xml:space="preserve">: abonnements et paniers récurrents à engagement souple, points de retrait situés sur les trajets domicile-travail plutôt qu’au seul lieu de production, élargissement des gammes pour couvrir une plus grande part du panier (et non les seuls fruits et légumes), horaires compatibles avec les actifs, et animation de la relation client (rappels, préparation anticipée des commandes, information sur la saisonnalité). La lecture omnicanale invite à ne pas opposer physique et numérique : la précommande en ligne assortie d’un retrait physique combine la commodité attendue et le contact direct valorisé.</w:t>
       </w:r>
     </w:p>
     <w:p>
@@ -2321,7 +2817,7 @@
         <w:t xml:space="preserve"> </w:t>
       </w:r>
       <w:r>
-        <w:t xml:space="preserve">Les motivations sont acquises (local, qualité, soutien) et les freins ne sont pas idéologiques mais logistiques : temps, accessibilité, régularité et diversité de l’offre (Feldmann et Hamm, 2015). Pour les pouvoirs publics et les collectivités — notamment dans le cadre des projets alimentaires territoriaux —, l’action utile porte moins sur la sensibilisation que sur l’</w:t>
+        <w:t xml:space="preserve">Les motivations sont acquises — local, qualité, goût, soutien aux agriculteurs arrivent loin devant le prix — et les freins ne sont pas idéologiques mais logistiques : temps, accessibilité, régularité et diversité de l’offre (Feldmann et Hamm, 2015). Pour les pouvoirs publics et les collectivités — notamment dans le cadre des projets alimentaires territoriaux —, l’action utile porte donc moins sur la sensibilisation, largement redondante, que sur l’</w:t>
       </w:r>
       <w:r>
         <w:rPr>
@@ -2334,7 +2830,7 @@
         <w:t xml:space="preserve"> </w:t>
       </w:r>
       <w:r>
-        <w:t xml:space="preserve">: mutualisation de points de vente et de logistique, horaires élargis, présence dans les zones mal desservies, articulation avec la restauration collective.</w:t>
+        <w:t xml:space="preserve">de la vente directe : mutualisation de points de vente et de logistique (halles de producteurs, drives fermiers partagés), horaires élargis, présence dans les zones périurbaines et rurales mal desservies, articulation avec la restauration collective pour sécuriser des débouchés réguliers aux producteurs. Autrement dit, financer des équipements et des services plutôt que des campagnes de conviction.</w:t>
       </w:r>
     </w:p>
     <w:p>
@@ -2352,7 +2848,23 @@
         <w:t xml:space="preserve"> </w:t>
       </w:r>
       <w:r>
-        <w:t xml:space="preserve">La vente directe n’étant pas socialement clivante, il n’y a pas lieu de la réserver à un segment aisé et urbain. Les dispositifs peuvent viser tous les publics, y compris les budgets modestes — le profil hors-hypermarché montre qu’un approvisionnement de proximité à petit budget est possible.</w:t>
+        <w:t xml:space="preserve">La vente directe n’étant pas socialement clivante — le modèle sociodémographique n’explique que 2 % de la variance de la pratique —, il n’y a pas lieu de la réserver, dans les représentations comme dans le ciblage marketing, à un segment aisé et urbain. Les dispositifs peuvent viser tous les publics, y compris les budgets modestes : le profil hors-hypermarché, plus âgé et moins doté, montre qu’un approvisionnement de proximité à petit budget est non seulement possible mais déjà pratiqué. Ce constat plaide contre une segmentation par le revenu ou la CSP, et pour une segmentation par la</w:t>
+      </w:r>
+      <w:r>
+        <w:t xml:space="preserve"> </w:t>
+      </w:r>
+      <w:r>
+        <w:rPr>
+          <w:b/>
+          <w:bCs/>
+        </w:rPr>
+        <w:t xml:space="preserve">stratégie d’approvisionnement</w:t>
+      </w:r>
+      <w:r>
+        <w:t xml:space="preserve"> </w:t>
+      </w:r>
+      <w:r>
+        <w:t xml:space="preserve">: c’est la configuration d’usage (généraliste, captif, omnivore…), et non la position sociale, qui prédit le recours à la vente directe et indique le levier pertinent.</w:t>
       </w:r>
     </w:p>
     <w:p>
@@ -2370,7 +2882,7 @@
         <w:t xml:space="preserve"> </w:t>
       </w:r>
       <w:r>
-        <w:t xml:space="preserve">Le prix n’est ni le principal moteur ni le principal frein. La grande distribution, qui intègre de plus en plus de références locales, a intérêt à jouer la</w:t>
+        <w:t xml:space="preserve">Le prix n’est ni le principal moteur ni le principal frein : il n’arrive qu’au cinquième rang des motivations. Chercher à concurrencer la grande distribution sur le terrain du prix serait donc une erreur de positionnement. Pour les producteurs, le registre payant est celui de l’origine, de la fraîcheur, du goût et de la relation. Pour la grande distribution elle-même, qui intègre de plus en plus de références locales, l’enjeu n’est pas de capter la vente directe mais de jouer la</w:t>
       </w:r>
       <w:r>
         <w:t xml:space="preserve"> </w:t>
@@ -2386,7 +2898,7 @@
         <w:t xml:space="preserve"> </w:t>
       </w:r>
       <w:r>
-        <w:t xml:space="preserve">(rayons de producteurs, traçabilité, mise en avant de l’origine) plutôt que la concurrence frontale sur le prix, sur un registre où la vente directe ne se bat pas.</w:t>
+        <w:t xml:space="preserve">— rayons de producteurs, traçabilité, mise en avant de l’origine —, sur un registre de sens où la vente directe a ouvert la voie. La lecture omnicanale se vérifie ici : les canaux se répartissent des fonctions plutôt qu’ils ne se cannibalisent.</w:t>
       </w:r>
     </w:p>
     <w:p>
@@ -2534,7 +3046,7 @@
         <w:t xml:space="preserve"> </w:t>
       </w:r>
       <w:r>
-        <w:t xml:space="preserve">: elle décrit un état, non une trajectoire, et ne permet pas de mesurer les effets récents de la crise sanitaire ou de l’inflation. Les mesures sont</w:t>
+        <w:t xml:space="preserve">: elle décrit un état, non une trajectoire, et ne permet pas de mesurer les effets récents de la crise sanitaire ou de l’inflation alimentaire, que la littérature documente par ailleurs. Les mesures sont</w:t>
       </w:r>
       <w:r>
         <w:t xml:space="preserve"> </w:t>
@@ -2550,7 +3062,7 @@
         <w:t xml:space="preserve"> </w:t>
       </w:r>
       <w:r>
-        <w:t xml:space="preserve">— fréquences et parts de budget reposent sur l’estimation des répondants. La part directe des achats réalisés sur les marchés n’étant pas isolable du budget « marché », le poids budgétaire total de la vente directe est légèrement sous-estimé. Enfin, la plus petite classe (hors-hypermarché) appelle la prudence dans l’interprétation de ses caractéristiques fines.</w:t>
+        <w:t xml:space="preserve">: les fréquences et surtout les parts de budget reposent sur l’estimation des répondants, sujette à des biais de mémoire et de désirabilité sociale — la sur-déclaration probable des comportements valorisés socialement renforce d’ailleurs le contraste que nous relevons avec le faible poids budgétaire effectif. La part directe des achats réalisés sur les marchés n’étant pas isolable du budget « marché », le poids budgétaire total de la vente directe est en outre légèrement sous-estimé. Enfin, la plus petite classe (hors-hypermarché) appelle la prudence dans l’interprétation de ses caractéristiques fines, et les motivations n’ont été analysées que pour le canal des marchés.</w:t>
       </w:r>
     </w:p>
     <w:p>

</xml_diff>

<commit_message>
DM manuscript: add 'trial vs anchoring' results sub-section (recency of purchase by direct-sales form) + Table 3 + Figure 3; decouple figure numbers from images; renumber; abstract/managerial tie-ins
</commit_message>
<xml_diff>
--- a/outputs/submitted/manuscrit_DM.docx
+++ b/outputs/submitted/manuscrit_DM.docx
@@ -2,7 +2,7 @@
 <file path=word/document.xml><?xml version="1.0" encoding="utf-8"?>
 <w:document xmlns:w="http://schemas.openxmlformats.org/wordprocessingml/2006/main" xmlns:m="http://schemas.openxmlformats.org/officeDocument/2006/math" xmlns:r="http://schemas.openxmlformats.org/officeDocument/2006/relationships" xmlns:o="urn:schemas-microsoft-com:office:office" xmlns:v="urn:schemas-microsoft-com:vml" xmlns:w10="urn:schemas-microsoft-com:office:word" xmlns:a="http://schemas.openxmlformats.org/drawingml/2006/main" xmlns:pic="http://schemas.openxmlformats.org/drawingml/2006/picture" xmlns:wp="http://schemas.openxmlformats.org/drawingml/2006/wordprocessingDrawing">
   <w:body>
-    <w:bookmarkStart w:id="40" w:name="beaucoup-lessaient-peu-linstallent"/>
+    <w:bookmarkStart w:id="44" w:name="beaucoup-lessaient-peu-linstallent"/>
     <w:p>
       <w:pPr>
         <w:pStyle w:val="Heading1"/>
@@ -100,7 +100,7 @@
         <w:t xml:space="preserve"> </w:t>
       </w:r>
       <w:r>
-        <w:t xml:space="preserve">La vente directe présente un paradoxe : elle touche 65 % des ménages mais ne pèse que 1,5 % du budget alimentaire national (8,5 % chez ses seuls acheteurs réguliers). Cinq stratégies d’approvisionnement se distinguent, des « captifs de la grande distribution » aux « omnivores engagés ». Le recours à la vente directe est faiblement déterminé par le profil sociodémographique : il traverse les catégories sociales.</w:t>
+        <w:t xml:space="preserve">La vente directe présente un paradoxe : elle touche 65 % des ménages mais ne pèse que 1,5 % du budget alimentaire national (8,5 % chez ses seuls acheteurs réguliers). Elle est largement essayée mais peu retenue — 46 % des ménages qui déclarent l’utiliser n’ont rien acheté au cours du mois écoulé, et l’abandon atteint 65 % pour les AMAP. Cinq stratégies d’approvisionnement se distinguent, des « captifs de la grande distribution » aux « omnivores engagés ». Le recours à la vente directe est enfin faiblement déterminé par le profil sociodémographique : il traverse les catégories sociales.</w:t>
       </w:r>
     </w:p>
     <w:p>
@@ -1875,13 +1875,13 @@
       </w:r>
     </w:p>
     <w:bookmarkEnd w:id="25"/>
-    <w:bookmarkStart w:id="29" w:name="cinq-stratégies-dapprovisionnement"/>
+    <w:bookmarkStart w:id="29" w:name="Xe5b250b76c2b938649582c3ae50d3dc9ec82d74"/>
     <w:p>
       <w:pPr>
         <w:pStyle w:val="Heading2"/>
       </w:pPr>
       <w:r>
-        <w:t xml:space="preserve">Cinq stratégies d’approvisionnement</w:t>
+        <w:t xml:space="preserve">De l’essai à l’ancrage : un engagement peu retenu</w:t>
       </w:r>
     </w:p>
     <w:p>
@@ -1889,30 +1889,869 @@
         <w:pStyle w:val="FirstParagraph"/>
       </w:pPr>
       <w:r>
-        <w:t xml:space="preserve">La typologie fait émerger cinq stratégies distinctes (Figure 3, Tableau 3), que l’examen conjoint de la pénétration et de l’usage régulier permet de caractériser. La lecture des deux mesures de vente directe — inclusive (au moins un achat) et régulière (au moins mensuel) — est essentielle, car un taux inclusif élevé peut recouvrir un simple essai.</w:t>
+        <w:t xml:space="preserve">Le faible poids budgétaire trouve un écho dans un second indicateur, indépendant : la</w:t>
+      </w:r>
+      <w:r>
+        <w:t xml:space="preserve"> </w:t>
+      </w:r>
+      <w:r>
+        <w:rPr>
+          <w:b/>
+          <w:bCs/>
+        </w:rPr>
+        <w:t xml:space="preserve">récence d’achat</w:t>
+      </w:r>
+      <w:r>
+        <w:t xml:space="preserve">. Au-delà de la question générale de fréquentation, l’enquête demande, pour chaque forme de vente directe, si le ménage y a acheté</w:t>
+      </w:r>
+      <w:r>
+        <w:t xml:space="preserve"> </w:t>
+      </w:r>
+      <w:r>
+        <w:rPr>
+          <w:b/>
+          <w:bCs/>
+        </w:rPr>
+        <w:t xml:space="preserve">au cours du mois écoulé</w:t>
+      </w:r>
+      <w:r>
+        <w:t xml:space="preserve"> </w:t>
+      </w:r>
+      <w:r>
+        <w:t xml:space="preserve">— distinguant l’acheteur actif de celui qui « achète encore, mais pas ce mois-ci », et de celui qui « en achetait, mais plus maintenant ». L’écart entre la fréquentation déclarée et cet achat récent est révélateur (Tableau 3, Figure 3).</w:t>
       </w:r>
     </w:p>
     <w:p>
       <w:pPr>
+        <w:pStyle w:val="BodyText"/>
+      </w:pPr>
+      <w:r>
+        <w:t xml:space="preserve">Au niveau agrégé, parmi les 509 ménages qui déclarent acheter en vente directe aux agriculteurs,</w:t>
+      </w:r>
+      <w:r>
+        <w:t xml:space="preserve"> </w:t>
+      </w:r>
+      <w:r>
+        <w:rPr>
+          <w:b/>
+          <w:bCs/>
+        </w:rPr>
+        <w:t xml:space="preserve">54 % seulement ont effectivement acheté au cours du mois écoulé</w:t>
+      </w:r>
+      <w:r>
+        <w:t xml:space="preserve"> </w:t>
+      </w:r>
+      <w:r>
+        <w:t xml:space="preserve">via l’une des formes ; 46 % n’ont rien acheté récemment. La fréquentation déclarée surestime donc sensiblement la pratique en cours.</w:t>
+      </w:r>
+    </w:p>
+    <w:p>
+      <w:pPr>
+        <w:pStyle w:val="BodyText"/>
+      </w:pPr>
+      <w:r>
+        <w:t xml:space="preserve">Surtout, la récence décroît fortement avec le degré d’engagement qu’exige la forme. Les formes conviviales et sans engagement — le marché — restent les plus ancrées : 62 % de ceux qui y ont déjà acheté au producteur l’ont fait le mois écoulé. À l’opposé, les formes les plus engageantes sont massivement</w:t>
+      </w:r>
+      <w:r>
+        <w:t xml:space="preserve"> </w:t>
+      </w:r>
+      <w:r>
+        <w:rPr>
+          <w:b/>
+          <w:bCs/>
+        </w:rPr>
+        <w:t xml:space="preserve">abandonnées</w:t>
+      </w:r>
+      <w:r>
+        <w:t xml:space="preserve"> </w:t>
+      </w:r>
+      <w:r>
+        <w:t xml:space="preserve">: parmi ceux qui les ont déjà essayées, 46 % ont cessé pour les paniers en ligne, 30 % pour les foires et salons, 27 % pour les halles. Le cas des AMAP est extrême : sur les ménages qui en ont un jour été clients,</w:t>
+      </w:r>
+      <w:r>
+        <w:t xml:space="preserve"> </w:t>
+      </w:r>
+      <w:r>
+        <w:rPr>
+          <w:b/>
+          <w:bCs/>
+        </w:rPr>
+        <w:t xml:space="preserve">près des deux tiers (65 %) ne le sont plus</w:t>
+      </w:r>
+      <w:r>
+        <w:t xml:space="preserve">.</w:t>
+      </w:r>
+    </w:p>
+    <w:p>
+      <w:pPr>
+        <w:pStyle w:val="BodyText"/>
+      </w:pPr>
+      <w:r>
+        <w:rPr>
+          <w:b/>
+          <w:bCs/>
+        </w:rPr>
+        <w:t xml:space="preserve">Tableau 3 : De l’essai à l’ancrage — récence d’achat par forme de vente directe</w:t>
+      </w:r>
+    </w:p>
+    <w:tbl>
+      <w:tblPr>
+        <w:tblStyle w:val="Table"/>
+        <w:tblW w:type="pct" w:w="5000"/>
+        <w:tblLayout w:type="fixed"/>
+        <w:tblLook w:firstRow="1" w:lastRow="0" w:firstColumn="0" w:lastColumn="0" w:noHBand="0" w:noVBand="0" w:val="0020"/>
+      </w:tblPr>
+      <w:tblGrid>
+        <w:gridCol w:w="1732"/>
+        <w:gridCol w:w="1237"/>
+        <w:gridCol w:w="1237"/>
+        <w:gridCol w:w="1237"/>
+        <w:gridCol w:w="1237"/>
+        <w:gridCol w:w="1237"/>
+      </w:tblGrid>
+      <w:tr>
+        <w:trPr>
+          <w:tblHeader w:val="on"/>
+        </w:trPr>
+        <w:tc>
+          <w:tcPr/>
+          <w:p>
+            <w:pPr>
+              <w:pStyle w:val="Compact"/>
+            </w:pPr>
+            <w:r>
+              <w:t xml:space="preserve">Forme</w:t>
+            </w:r>
+          </w:p>
+        </w:tc>
+        <w:tc>
+          <w:tcPr/>
+          <w:p>
+            <w:pPr>
+              <w:pStyle w:val="Compact"/>
+              <w:jc w:val="center"/>
+            </w:pPr>
+            <w:r>
+              <w:t xml:space="preserve">Interrogés (n)</w:t>
+            </w:r>
+          </w:p>
+        </w:tc>
+        <w:tc>
+          <w:tcPr/>
+          <w:p>
+            <w:pPr>
+              <w:pStyle w:val="Compact"/>
+              <w:jc w:val="center"/>
+            </w:pPr>
+            <w:r>
+              <w:t xml:space="preserve">Ont déjà acheté (n)</w:t>
+            </w:r>
+          </w:p>
+        </w:tc>
+        <w:tc>
+          <w:tcPr/>
+          <w:p>
+            <w:pPr>
+              <w:pStyle w:val="Compact"/>
+              <w:jc w:val="center"/>
+            </w:pPr>
+            <w:r>
+              <w:t xml:space="preserve">Achat le mois écoulé (% des essayeurs)</w:t>
+            </w:r>
+          </w:p>
+        </w:tc>
+        <w:tc>
+          <w:tcPr/>
+          <w:p>
+            <w:pPr>
+              <w:pStyle w:val="Compact"/>
+              <w:jc w:val="center"/>
+            </w:pPr>
+            <w:r>
+              <w:t xml:space="preserve">Achat le mois écoulé (% des interrogés)</w:t>
+            </w:r>
+          </w:p>
+        </w:tc>
+        <w:tc>
+          <w:tcPr/>
+          <w:p>
+            <w:pPr>
+              <w:pStyle w:val="Compact"/>
+              <w:jc w:val="center"/>
+            </w:pPr>
+            <w:r>
+              <w:t xml:space="preserve">En achetaient, plus maintenant (% des essayeurs)</w:t>
+            </w:r>
+          </w:p>
+        </w:tc>
+      </w:tr>
+      <w:tr>
+        <w:tc>
+          <w:tcPr/>
+          <w:p>
+            <w:pPr>
+              <w:pStyle w:val="Compact"/>
+            </w:pPr>
+            <w:r>
+              <w:t xml:space="preserve">Marché (au producteur)</w:t>
+            </w:r>
+          </w:p>
+        </w:tc>
+        <w:tc>
+          <w:tcPr/>
+          <w:p>
+            <w:pPr>
+              <w:pStyle w:val="Compact"/>
+              <w:jc w:val="center"/>
+            </w:pPr>
+            <w:r>
+              <w:t xml:space="preserve">810</w:t>
+            </w:r>
+          </w:p>
+        </w:tc>
+        <w:tc>
+          <w:tcPr/>
+          <w:p>
+            <w:pPr>
+              <w:pStyle w:val="Compact"/>
+              <w:jc w:val="center"/>
+            </w:pPr>
+            <w:r>
+              <w:t xml:space="preserve">770</w:t>
+            </w:r>
+          </w:p>
+        </w:tc>
+        <w:tc>
+          <w:tcPr/>
+          <w:p>
+            <w:pPr>
+              <w:pStyle w:val="Compact"/>
+              <w:jc w:val="center"/>
+            </w:pPr>
+            <w:r>
+              <w:t xml:space="preserve">62 %</w:t>
+            </w:r>
+          </w:p>
+        </w:tc>
+        <w:tc>
+          <w:tcPr/>
+          <w:p>
+            <w:pPr>
+              <w:pStyle w:val="Compact"/>
+              <w:jc w:val="center"/>
+            </w:pPr>
+            <w:r>
+              <w:t xml:space="preserve">59 %</w:t>
+            </w:r>
+          </w:p>
+        </w:tc>
+        <w:tc>
+          <w:tcPr/>
+          <w:p>
+            <w:pPr>
+              <w:pStyle w:val="Compact"/>
+              <w:jc w:val="center"/>
+            </w:pPr>
+            <w:r>
+              <w:t xml:space="preserve">6 %</w:t>
+            </w:r>
+          </w:p>
+        </w:tc>
+      </w:tr>
+      <w:tr>
+        <w:tc>
+          <w:tcPr/>
+          <w:p>
+            <w:pPr>
+              <w:pStyle w:val="Compact"/>
+            </w:pPr>
+            <w:r>
+              <w:t xml:space="preserve">À la ferme</w:t>
+            </w:r>
+          </w:p>
+        </w:tc>
+        <w:tc>
+          <w:tcPr/>
+          <w:p>
+            <w:pPr>
+              <w:pStyle w:val="Compact"/>
+              <w:jc w:val="center"/>
+            </w:pPr>
+            <w:r>
+              <w:t xml:space="preserve">509</w:t>
+            </w:r>
+          </w:p>
+        </w:tc>
+        <w:tc>
+          <w:tcPr/>
+          <w:p>
+            <w:pPr>
+              <w:pStyle w:val="Compact"/>
+              <w:jc w:val="center"/>
+            </w:pPr>
+            <w:r>
+              <w:t xml:space="preserve">433</w:t>
+            </w:r>
+          </w:p>
+        </w:tc>
+        <w:tc>
+          <w:tcPr/>
+          <w:p>
+            <w:pPr>
+              <w:pStyle w:val="Compact"/>
+              <w:jc w:val="center"/>
+            </w:pPr>
+            <w:r>
+              <w:t xml:space="preserve">40 %</w:t>
+            </w:r>
+          </w:p>
+        </w:tc>
+        <w:tc>
+          <w:tcPr/>
+          <w:p>
+            <w:pPr>
+              <w:pStyle w:val="Compact"/>
+              <w:jc w:val="center"/>
+            </w:pPr>
+            <w:r>
+              <w:t xml:space="preserve">34 %</w:t>
+            </w:r>
+          </w:p>
+        </w:tc>
+        <w:tc>
+          <w:tcPr/>
+          <w:p>
+            <w:pPr>
+              <w:pStyle w:val="Compact"/>
+              <w:jc w:val="center"/>
+            </w:pPr>
+            <w:r>
+              <w:t xml:space="preserve">19 %</w:t>
+            </w:r>
+          </w:p>
+        </w:tc>
+      </w:tr>
+      <w:tr>
+        <w:tc>
+          <w:tcPr/>
+          <w:p>
+            <w:pPr>
+              <w:pStyle w:val="Compact"/>
+            </w:pPr>
+            <w:r>
+              <w:t xml:space="preserve">Magasin de producteurs</w:t>
+            </w:r>
+          </w:p>
+        </w:tc>
+        <w:tc>
+          <w:tcPr/>
+          <w:p>
+            <w:pPr>
+              <w:pStyle w:val="Compact"/>
+              <w:jc w:val="center"/>
+            </w:pPr>
+            <w:r>
+              <w:t xml:space="preserve">509</w:t>
+            </w:r>
+          </w:p>
+        </w:tc>
+        <w:tc>
+          <w:tcPr/>
+          <w:p>
+            <w:pPr>
+              <w:pStyle w:val="Compact"/>
+              <w:jc w:val="center"/>
+            </w:pPr>
+            <w:r>
+              <w:t xml:space="preserve">351</w:t>
+            </w:r>
+          </w:p>
+        </w:tc>
+        <w:tc>
+          <w:tcPr/>
+          <w:p>
+            <w:pPr>
+              <w:pStyle w:val="Compact"/>
+              <w:jc w:val="center"/>
+            </w:pPr>
+            <w:r>
+              <w:t xml:space="preserve">29 %</w:t>
+            </w:r>
+          </w:p>
+        </w:tc>
+        <w:tc>
+          <w:tcPr/>
+          <w:p>
+            <w:pPr>
+              <w:pStyle w:val="Compact"/>
+              <w:jc w:val="center"/>
+            </w:pPr>
+            <w:r>
+              <w:t xml:space="preserve">20 %</w:t>
+            </w:r>
+          </w:p>
+        </w:tc>
+        <w:tc>
+          <w:tcPr/>
+          <w:p>
+            <w:pPr>
+              <w:pStyle w:val="Compact"/>
+              <w:jc w:val="center"/>
+            </w:pPr>
+            <w:r>
+              <w:t xml:space="preserve">22 %</w:t>
+            </w:r>
+          </w:p>
+        </w:tc>
+      </w:tr>
+      <w:tr>
+        <w:tc>
+          <w:tcPr/>
+          <w:p>
+            <w:pPr>
+              <w:pStyle w:val="Compact"/>
+            </w:pPr>
+            <w:r>
+              <w:t xml:space="preserve">Halle commerçante</w:t>
+            </w:r>
+          </w:p>
+        </w:tc>
+        <w:tc>
+          <w:tcPr/>
+          <w:p>
+            <w:pPr>
+              <w:pStyle w:val="Compact"/>
+              <w:jc w:val="center"/>
+            </w:pPr>
+            <w:r>
+              <w:t xml:space="preserve">509</w:t>
+            </w:r>
+          </w:p>
+        </w:tc>
+        <w:tc>
+          <w:tcPr/>
+          <w:p>
+            <w:pPr>
+              <w:pStyle w:val="Compact"/>
+              <w:jc w:val="center"/>
+            </w:pPr>
+            <w:r>
+              <w:t xml:space="preserve">359</w:t>
+            </w:r>
+          </w:p>
+        </w:tc>
+        <w:tc>
+          <w:tcPr/>
+          <w:p>
+            <w:pPr>
+              <w:pStyle w:val="Compact"/>
+              <w:jc w:val="center"/>
+            </w:pPr>
+            <w:r>
+              <w:t xml:space="preserve">23 %</w:t>
+            </w:r>
+          </w:p>
+        </w:tc>
+        <w:tc>
+          <w:tcPr/>
+          <w:p>
+            <w:pPr>
+              <w:pStyle w:val="Compact"/>
+              <w:jc w:val="center"/>
+            </w:pPr>
+            <w:r>
+              <w:t xml:space="preserve">16 %</w:t>
+            </w:r>
+          </w:p>
+        </w:tc>
+        <w:tc>
+          <w:tcPr/>
+          <w:p>
+            <w:pPr>
+              <w:pStyle w:val="Compact"/>
+              <w:jc w:val="center"/>
+            </w:pPr>
+            <w:r>
+              <w:t xml:space="preserve">27 %</w:t>
+            </w:r>
+          </w:p>
+        </w:tc>
+      </w:tr>
+      <w:tr>
+        <w:tc>
+          <w:tcPr/>
+          <w:p>
+            <w:pPr>
+              <w:pStyle w:val="Compact"/>
+            </w:pPr>
+            <w:r>
+              <w:t xml:space="preserve">Panier en ligne (La Ruche…)</w:t>
+            </w:r>
+          </w:p>
+        </w:tc>
+        <w:tc>
+          <w:tcPr/>
+          <w:p>
+            <w:pPr>
+              <w:pStyle w:val="Compact"/>
+              <w:jc w:val="center"/>
+            </w:pPr>
+            <w:r>
+              <w:t xml:space="preserve">509</w:t>
+            </w:r>
+          </w:p>
+        </w:tc>
+        <w:tc>
+          <w:tcPr/>
+          <w:p>
+            <w:pPr>
+              <w:pStyle w:val="Compact"/>
+              <w:jc w:val="center"/>
+            </w:pPr>
+            <w:r>
+              <w:t xml:space="preserve">155</w:t>
+            </w:r>
+          </w:p>
+        </w:tc>
+        <w:tc>
+          <w:tcPr/>
+          <w:p>
+            <w:pPr>
+              <w:pStyle w:val="Compact"/>
+              <w:jc w:val="center"/>
+            </w:pPr>
+            <w:r>
+              <w:t xml:space="preserve">18 %</w:t>
+            </w:r>
+          </w:p>
+        </w:tc>
+        <w:tc>
+          <w:tcPr/>
+          <w:p>
+            <w:pPr>
+              <w:pStyle w:val="Compact"/>
+              <w:jc w:val="center"/>
+            </w:pPr>
+            <w:r>
+              <w:t xml:space="preserve">6 %</w:t>
+            </w:r>
+          </w:p>
+        </w:tc>
+        <w:tc>
+          <w:tcPr/>
+          <w:p>
+            <w:pPr>
+              <w:pStyle w:val="Compact"/>
+              <w:jc w:val="center"/>
+            </w:pPr>
+            <w:r>
+              <w:t xml:space="preserve">46 %</w:t>
+            </w:r>
+          </w:p>
+        </w:tc>
+      </w:tr>
+      <w:tr>
+        <w:tc>
+          <w:tcPr/>
+          <w:p>
+            <w:pPr>
+              <w:pStyle w:val="Compact"/>
+            </w:pPr>
+            <w:r>
+              <w:t xml:space="preserve">Foire / salon</w:t>
+            </w:r>
+          </w:p>
+        </w:tc>
+        <w:tc>
+          <w:tcPr/>
+          <w:p>
+            <w:pPr>
+              <w:pStyle w:val="Compact"/>
+              <w:jc w:val="center"/>
+            </w:pPr>
+            <w:r>
+              <w:t xml:space="preserve">509</w:t>
+            </w:r>
+          </w:p>
+        </w:tc>
+        <w:tc>
+          <w:tcPr/>
+          <w:p>
+            <w:pPr>
+              <w:pStyle w:val="Compact"/>
+              <w:jc w:val="center"/>
+            </w:pPr>
+            <w:r>
+              <w:t xml:space="preserve">297</w:t>
+            </w:r>
+          </w:p>
+        </w:tc>
+        <w:tc>
+          <w:tcPr/>
+          <w:p>
+            <w:pPr>
+              <w:pStyle w:val="Compact"/>
+              <w:jc w:val="center"/>
+            </w:pPr>
+            <w:r>
+              <w:t xml:space="preserve">11 %</w:t>
+            </w:r>
+          </w:p>
+        </w:tc>
+        <w:tc>
+          <w:tcPr/>
+          <w:p>
+            <w:pPr>
+              <w:pStyle w:val="Compact"/>
+              <w:jc w:val="center"/>
+            </w:pPr>
+            <w:r>
+              <w:t xml:space="preserve">7 %</w:t>
+            </w:r>
+          </w:p>
+        </w:tc>
+        <w:tc>
+          <w:tcPr/>
+          <w:p>
+            <w:pPr>
+              <w:pStyle w:val="Compact"/>
+              <w:jc w:val="center"/>
+            </w:pPr>
+            <w:r>
+              <w:t xml:space="preserve">30 %</w:t>
+            </w:r>
+          </w:p>
+        </w:tc>
+      </w:tr>
+      <w:tr>
+        <w:tc>
+          <w:tcPr/>
+          <w:p>
+            <w:pPr>
+              <w:pStyle w:val="Compact"/>
+            </w:pPr>
+            <w:r>
+              <w:t xml:space="preserve">AMAP*</w:t>
+            </w:r>
+          </w:p>
+        </w:tc>
+        <w:tc>
+          <w:tcPr/>
+          <w:p>
+            <w:pPr>
+              <w:pStyle w:val="Compact"/>
+              <w:jc w:val="center"/>
+            </w:pPr>
+            <w:r>
+              <w:t xml:space="preserve">509</w:t>
+            </w:r>
+          </w:p>
+        </w:tc>
+        <w:tc>
+          <w:tcPr/>
+          <w:p>
+            <w:pPr>
+              <w:pStyle w:val="Compact"/>
+              <w:jc w:val="center"/>
+            </w:pPr>
+            <w:r>
+              <w:t xml:space="preserve">116</w:t>
+            </w:r>
+          </w:p>
+        </w:tc>
+        <w:tc>
+          <w:tcPr/>
+          <w:p>
+            <w:pPr>
+              <w:pStyle w:val="Compact"/>
+              <w:jc w:val="center"/>
+            </w:pPr>
+            <w:r>
+              <w:t xml:space="preserve">35 %</w:t>
+            </w:r>
+          </w:p>
+        </w:tc>
+        <w:tc>
+          <w:tcPr/>
+          <w:p>
+            <w:pPr>
+              <w:pStyle w:val="Compact"/>
+              <w:jc w:val="center"/>
+            </w:pPr>
+            <w:r>
+              <w:t xml:space="preserve">8 %</w:t>
+            </w:r>
+          </w:p>
+        </w:tc>
+        <w:tc>
+          <w:tcPr/>
+          <w:p>
+            <w:pPr>
+              <w:pStyle w:val="Compact"/>
+              <w:jc w:val="center"/>
+            </w:pPr>
+            <w:r>
+              <w:t xml:space="preserve">65 %</w:t>
+            </w:r>
+          </w:p>
+        </w:tc>
+      </w:tr>
+    </w:tbl>
+    <w:p>
+      <w:pPr>
+        <w:pStyle w:val="BodyText"/>
+      </w:pPr>
+      <w:r>
+        <w:rPr>
+          <w:i/>
+          <w:iCs/>
+        </w:rPr>
+        <w:t xml:space="preserve">Base « interrogés » : chalands de marché (810) pour le marché ; acheteurs en vente directe aux agriculteurs (509) pour les autres formes. *AMAP : codage sans référence au mois écoulé (adhérent actuel vs ancien) ; « % des essayeurs » = adhérents actuels parmi les adhérents actuels et anciens ; « en achetaient, plus maintenant » = anciens adhérents.</w:t>
+      </w:r>
+    </w:p>
+    <w:p>
+      <w:pPr>
         <w:pStyle w:val="CaptionedFigure"/>
       </w:pPr>
       <w:r>
         <w:drawing>
           <wp:inline>
-            <wp:extent cx="5740230" cy="5015438"/>
+            <wp:extent cx="5969000" cy="2573970"/>
             <wp:effectExtent b="0" l="0" r="0" t="0"/>
             <wp:docPr descr="Figure 3" title="" id="27" name="Picture"/>
             <a:graphic>
               <a:graphicData uri="http://schemas.openxmlformats.org/drawingml/2006/picture">
                 <pic:pic>
                   <pic:nvPicPr>
-                    <pic:cNvPr descr="/home/user/formation-Claude/figures/png/fig3_plan_factoriel_nb.png" id="28" name="Picture"/>
+                    <pic:cNvPr descr="/home/user/formation-Claude/figures/png/fig6_essai_ancrage_nb.png" id="28" name="Picture"/>
                     <pic:cNvPicPr>
                       <a:picLocks noChangeArrowheads="1" noChangeAspect="1"/>
                     </pic:cNvPicPr>
                   </pic:nvPicPr>
                   <pic:blipFill>
                     <a:blip r:embed="rId26"/>
+                    <a:stretch>
+                      <a:fillRect/>
+                    </a:stretch>
+                  </pic:blipFill>
+                  <pic:spPr bwMode="auto">
+                    <a:xfrm>
+                      <a:off x="0" y="0"/>
+                      <a:ext cx="5969000" cy="2573970"/>
+                    </a:xfrm>
+                    <a:prstGeom prst="rect">
+                      <a:avLst/>
+                    </a:prstGeom>
+                    <a:noFill/>
+                    <a:ln w="9525">
+                      <a:noFill/>
+                      <a:headEnd/>
+                      <a:tailEnd/>
+                    </a:ln>
+                  </pic:spPr>
+                </pic:pic>
+              </a:graphicData>
+            </a:graphic>
+          </wp:inline>
+        </w:drawing>
+      </w:r>
+    </w:p>
+    <w:p>
+      <w:pPr>
+        <w:pStyle w:val="ImageCaption"/>
+      </w:pPr>
+      <w:r>
+        <w:t xml:space="preserve">Figure 3</w:t>
+      </w:r>
+    </w:p>
+    <w:p>
+      <w:pPr>
+        <w:pStyle w:val="BodyText"/>
+      </w:pPr>
+      <w:r>
+        <w:rPr>
+          <w:b/>
+          <w:bCs/>
+        </w:rPr>
+        <w:t xml:space="preserve">Figure 3 : De l’essai à l’ancrage — récence d’achat par forme de vente directe</w:t>
+      </w:r>
+    </w:p>
+    <w:p>
+      <w:pPr>
+        <w:pStyle w:val="BodyText"/>
+      </w:pPr>
+      <w:r>
+        <w:t xml:space="preserve">Ce gradient confirme, par un tout autre chemin que le budget, le même diagnostic : la vente directe est</w:t>
+      </w:r>
+      <w:r>
+        <w:t xml:space="preserve"> </w:t>
+      </w:r>
+      <w:r>
+        <w:rPr>
+          <w:b/>
+          <w:bCs/>
+        </w:rPr>
+        <w:t xml:space="preserve">largement essayée, mais son usage peine à s’installer</w:t>
+      </w:r>
+      <w:r>
+        <w:t xml:space="preserve"> </w:t>
+      </w:r>
+      <w:r>
+        <w:t xml:space="preserve">— et d’autant plus que la forme exige de l’engagement. Le point de fuite n’est donc pas l’accès ou l’essai, déjà acquis, mais la</w:t>
+      </w:r>
+      <w:r>
+        <w:t xml:space="preserve"> </w:t>
+      </w:r>
+      <w:r>
+        <w:rPr>
+          <w:b/>
+          <w:bCs/>
+        </w:rPr>
+        <w:t xml:space="preserve">rétention</w:t>
+      </w:r>
+      <w:r>
+        <w:t xml:space="preserve">.</w:t>
+      </w:r>
+    </w:p>
+    <w:bookmarkEnd w:id="29"/>
+    <w:bookmarkStart w:id="33" w:name="cinq-stratégies-dapprovisionnement"/>
+    <w:p>
+      <w:pPr>
+        <w:pStyle w:val="Heading2"/>
+      </w:pPr>
+      <w:r>
+        <w:t xml:space="preserve">Cinq stratégies d’approvisionnement</w:t>
+      </w:r>
+    </w:p>
+    <w:p>
+      <w:pPr>
+        <w:pStyle w:val="FirstParagraph"/>
+      </w:pPr>
+      <w:r>
+        <w:t xml:space="preserve">La typologie fait émerger cinq stratégies distinctes (Figure 4, Tableau 4), que l’examen conjoint de la pénétration et de l’usage régulier permet de caractériser. La lecture des deux mesures de vente directe — inclusive (au moins un achat) et régulière (au moins mensuel) — est essentielle, car un taux inclusif élevé peut recouvrir un simple essai.</w:t>
+      </w:r>
+    </w:p>
+    <w:p>
+      <w:pPr>
+        <w:pStyle w:val="CaptionedFigure"/>
+      </w:pPr>
+      <w:r>
+        <w:drawing>
+          <wp:inline>
+            <wp:extent cx="5740230" cy="5015438"/>
+            <wp:effectExtent b="0" l="0" r="0" t="0"/>
+            <wp:docPr descr="Figure 4" title="" id="31" name="Picture"/>
+            <a:graphic>
+              <a:graphicData uri="http://schemas.openxmlformats.org/drawingml/2006/picture">
+                <pic:pic>
+                  <pic:nvPicPr>
+                    <pic:cNvPr descr="/home/user/formation-Claude/figures/png/fig3_plan_factoriel_nb.png" id="32" name="Picture"/>
+                    <pic:cNvPicPr>
+                      <a:picLocks noChangeArrowheads="1" noChangeAspect="1"/>
+                    </pic:cNvPicPr>
+                  </pic:nvPicPr>
+                  <pic:blipFill>
+                    <a:blip r:embed="rId30"/>
                     <a:stretch>
                       <a:fillRect/>
                     </a:stretch>
@@ -1944,7 +2783,7 @@
         <w:pStyle w:val="ImageCaption"/>
       </w:pPr>
       <w:r>
-        <w:t xml:space="preserve">Figure 3</w:t>
+        <w:t xml:space="preserve">Figure 4</w:t>
       </w:r>
     </w:p>
     <w:p>
@@ -1956,7 +2795,7 @@
           <w:b/>
           <w:bCs/>
         </w:rPr>
-        <w:t xml:space="preserve">Figure 3 : Plan factoriel (ACM) et classes de stratégie</w:t>
+        <w:t xml:space="preserve">Figure 4 : Plan factoriel (ACM) et classes de stratégie</w:t>
       </w:r>
     </w:p>
     <w:p>
@@ -1968,7 +2807,7 @@
           <w:b/>
           <w:bCs/>
         </w:rPr>
-        <w:t xml:space="preserve">Tableau 3 : Les cinq stratégies d’approvisionnement</w:t>
+        <w:t xml:space="preserve">Tableau 4 : Les cinq stratégies d’approvisionnement</w:t>
       </w:r>
     </w:p>
     <w:tbl>
@@ -2542,8 +3381,8 @@
         <w:t xml:space="preserve">— la stratégie d’approvisionnement — dans laquelle elle s’inscrit : les omnivores l’installent dans une routine multi-canal dense, les captifs s’en tiennent à distance, les multi-canal conventionnels l’essaient sans la pérenniser. Cette grille de segmentation par les pratiques est directement actionnable, car chaque configuration appelle un levier différent.</w:t>
       </w:r>
     </w:p>
-    <w:bookmarkEnd w:id="29"/>
-    <w:bookmarkStart w:id="36" w:name="X7f871b1800f415beac489a6ed1e968c0967dae2"/>
+    <w:bookmarkEnd w:id="33"/>
+    <w:bookmarkStart w:id="40" w:name="X7f871b1800f415beac489a6ed1e968c0967dae2"/>
     <w:p>
       <w:pPr>
         <w:pStyle w:val="Heading2"/>
@@ -2565,7 +3404,7 @@
         <w:pStyle w:val="BodyText"/>
       </w:pPr>
       <w:r>
-        <w:t xml:space="preserve">La régression logistique du recours à la vente directe (Figure 4) le confirme : le modèle explique très peu de sa variance (pseudo-R² de McFadden = 0,022). Deux effets seulement ressortent nettement : appartenir aux cadres et professions libérales multiplie par 2,16 les chances de pratiquer la vente directe (p = 0,003), et un budget alimentaire élevé l’accroît modérément (odds-ratio = 1,18 par écart-type, p = 0,028) ; les professions intermédiaires sont également au-dessus de la référence (odds-ratio = 1,60, p = 0,027). En revanche, le sexe, l’âge et la taille d’agglomération n’ont pas d’effet significatif.</w:t>
+        <w:t xml:space="preserve">La régression logistique du recours à la vente directe (Figure 5) le confirme : le modèle explique très peu de sa variance (pseudo-R² de McFadden = 0,022). Deux effets seulement ressortent nettement : appartenir aux cadres et professions libérales multiplie par 2,16 les chances de pratiquer la vente directe (p = 0,003), et un budget alimentaire élevé l’accroît modérément (odds-ratio = 1,18 par écart-type, p = 0,028) ; les professions intermédiaires sont également au-dessus de la référence (odds-ratio = 1,60, p = 0,027). En revanche, le sexe, l’âge et la taille d’agglomération n’ont pas d’effet significatif.</w:t>
       </w:r>
     </w:p>
     <w:p>
@@ -2577,18 +3416,18 @@
           <wp:inline>
             <wp:extent cx="5969000" cy="4243199"/>
             <wp:effectExtent b="0" l="0" r="0" t="0"/>
-            <wp:docPr descr="Figure 4" title="" id="31" name="Picture"/>
+            <wp:docPr descr="Figure 5" title="" id="35" name="Picture"/>
             <a:graphic>
               <a:graphicData uri="http://schemas.openxmlformats.org/drawingml/2006/picture">
                 <pic:pic>
                   <pic:nvPicPr>
-                    <pic:cNvPr descr="/home/user/formation-Claude/figures/png/fig4_regression_or_nb.png" id="32" name="Picture"/>
+                    <pic:cNvPr descr="/home/user/formation-Claude/figures/png/fig4_regression_or_nb.png" id="36" name="Picture"/>
                     <pic:cNvPicPr>
                       <a:picLocks noChangeArrowheads="1" noChangeAspect="1"/>
                     </pic:cNvPicPr>
                   </pic:nvPicPr>
                   <pic:blipFill>
-                    <a:blip r:embed="rId30"/>
+                    <a:blip r:embed="rId34"/>
                     <a:stretch>
                       <a:fillRect/>
                     </a:stretch>
@@ -2620,7 +3459,7 @@
         <w:pStyle w:val="ImageCaption"/>
       </w:pPr>
       <w:r>
-        <w:t xml:space="preserve">Figure 4</w:t>
+        <w:t xml:space="preserve">Figure 5</w:t>
       </w:r>
     </w:p>
     <w:p>
@@ -2632,7 +3471,7 @@
           <w:b/>
           <w:bCs/>
         </w:rPr>
-        <w:t xml:space="preserve">Figure 4 : Déterminants de l’usage de la vente directe (odds-ratios)</w:t>
+        <w:t xml:space="preserve">Figure 5 : Déterminants de l’usage de la vente directe (odds-ratios)</w:t>
       </w:r>
     </w:p>
     <w:p>
@@ -2648,7 +3487,7 @@
         <w:pStyle w:val="BodyText"/>
       </w:pPr>
       <w:r>
-        <w:t xml:space="preserve">Interrogés sur leurs raisons d’acheter sur les marchés — lieu de contact direct le plus fréquent avec les producteurs —, les répondants placent en tête les produits locaux (cités dans le top 3 par 51 % d’entre eux), le circuit court (41 %), le goût (39 %) et le soutien aux agriculteurs (34 %) ; le prix n’arrive qu’au cinquième rang (18 %) (Figure 5). La vente directe se joue sur le registre de la qualité et du sens, non sur celui de l’économie monétaire.</w:t>
+        <w:t xml:space="preserve">Interrogés sur leurs raisons d’acheter sur les marchés — lieu de contact direct le plus fréquent avec les producteurs —, les répondants placent en tête les produits locaux (cités dans le top 3 par 51 % d’entre eux), le circuit court (41 %), le goût (39 %) et le soutien aux agriculteurs (34 %) ; le prix n’arrive qu’au cinquième rang (18 %) (Figure 6). La vente directe se joue sur le registre de la qualité et du sens, non sur celui de l’économie monétaire.</w:t>
       </w:r>
     </w:p>
     <w:p>
@@ -2660,18 +3499,18 @@
           <wp:inline>
             <wp:extent cx="5969000" cy="3501978"/>
             <wp:effectExtent b="0" l="0" r="0" t="0"/>
-            <wp:docPr descr="Figure 5" title="" id="34" name="Picture"/>
+            <wp:docPr descr="Figure 6" title="" id="38" name="Picture"/>
             <a:graphic>
               <a:graphicData uri="http://schemas.openxmlformats.org/drawingml/2006/picture">
                 <pic:pic>
                   <pic:nvPicPr>
-                    <pic:cNvPr descr="/home/user/formation-Claude/figures/png/fig5_motivations_marche_nb.png" id="35" name="Picture"/>
+                    <pic:cNvPr descr="/home/user/formation-Claude/figures/png/fig5_motivations_marche_nb.png" id="39" name="Picture"/>
                     <pic:cNvPicPr>
                       <a:picLocks noChangeArrowheads="1" noChangeAspect="1"/>
                     </pic:cNvPicPr>
                   </pic:nvPicPr>
                   <pic:blipFill>
-                    <a:blip r:embed="rId33"/>
+                    <a:blip r:embed="rId37"/>
                     <a:stretch>
                       <a:fillRect/>
                     </a:stretch>
@@ -2703,7 +3542,7 @@
         <w:pStyle w:val="ImageCaption"/>
       </w:pPr>
       <w:r>
-        <w:t xml:space="preserve">Figure 5</w:t>
+        <w:t xml:space="preserve">Figure 6</w:t>
       </w:r>
     </w:p>
     <w:p>
@@ -2715,11 +3554,11 @@
           <w:b/>
           <w:bCs/>
         </w:rPr>
-        <w:t xml:space="preserve">Figure 5 : Motivations d’achat sur les marchés</w:t>
+        <w:t xml:space="preserve">Figure 6 : Motivations d’achat sur les marchés</w:t>
       </w:r>
     </w:p>
-    <w:bookmarkEnd w:id="36"/>
-    <w:bookmarkStart w:id="37" w:name="ce-que-les-acteurs-peuvent-en-faire"/>
+    <w:bookmarkEnd w:id="40"/>
+    <w:bookmarkStart w:id="41" w:name="ce-que-les-acteurs-peuvent-en-faire"/>
     <w:p>
       <w:pPr>
         <w:pStyle w:val="Heading2"/>
@@ -2783,7 +3622,20 @@
         <w:t xml:space="preserve"> </w:t>
       </w:r>
       <w:r>
-        <w:t xml:space="preserve">: les faire passer de l’essai à l’habitude produirait un effet budgétaire bien supérieur à celui du recrutement de nouveaux essayeurs. Pour les producteurs et les réseaux de vente directe, cela oriente l’effort vers les</w:t>
+        <w:t xml:space="preserve">: les faire passer de l’essai à l’habitude produirait un effet budgétaire bien supérieur à celui du recrutement de nouveaux essayeurs. Le fort taux d’abandon des formes les plus engageantes — jusqu’à 65 % pour les AMAP — confirme que l’enjeu est bien la</w:t>
+      </w:r>
+      <w:r>
+        <w:t xml:space="preserve"> </w:t>
+      </w:r>
+      <w:r>
+        <w:rPr>
+          <w:b/>
+          <w:bCs/>
+        </w:rPr>
+        <w:t xml:space="preserve">rétention</w:t>
+      </w:r>
+      <w:r>
+        <w:t xml:space="preserve">, non l’acquisition. Pour les producteurs et les réseaux de vente directe, cela oriente l’effort vers les</w:t>
       </w:r>
       <w:r>
         <w:t xml:space="preserve"> </w:t>
@@ -3015,8 +3867,8 @@
         </w:pict>
       </w:r>
     </w:p>
-    <w:bookmarkEnd w:id="37"/>
-    <w:bookmarkStart w:id="38" w:name="limites-et-voies-de-recherche"/>
+    <w:bookmarkEnd w:id="41"/>
+    <w:bookmarkStart w:id="42" w:name="limites-et-voies-de-recherche"/>
     <w:p>
       <w:pPr>
         <w:pStyle w:val="Heading2"/>
@@ -3121,8 +3973,8 @@
         <w:t xml:space="preserve">— que révèle l’écart entre vente directe inclusive et régulière — mériterait d’être approfondie : comprendre ce qui fait basculer un ménage de l’un à l’autre est sans doute la question la plus utile pour qui veut faire passer la vente directe du répertoire d’appoint au socle de l’approvisionnement.</w:t>
       </w:r>
     </w:p>
-    <w:bookmarkEnd w:id="38"/>
-    <w:bookmarkStart w:id="39" w:name="références"/>
+    <w:bookmarkEnd w:id="42"/>
+    <w:bookmarkStart w:id="43" w:name="références"/>
     <w:p>
       <w:pPr>
         <w:pStyle w:val="Heading2"/>
@@ -3584,8 +4436,8 @@
         <w:t xml:space="preserve">, Paris, Pearson.</w:t>
       </w:r>
     </w:p>
-    <w:bookmarkEnd w:id="39"/>
-    <w:bookmarkEnd w:id="40"/>
+    <w:bookmarkEnd w:id="43"/>
+    <w:bookmarkEnd w:id="44"/>
     <w:sectPr>
       <w:pgSz w:h="15840" w:w="12240"/>
       <w:pgMar w:bottom="1417" w:footer="720" w:gutter="0" w:header="720" w:left="1417" w:right="1417" w:top="1417"/>

</xml_diff>

<commit_message>
refs: replace dated Kneafsey et al. (2013) with Agreste (2023) recensement + Enthoven & Van den Broeck (2021) review, in DM manuscript, academic version and biblio
</commit_message>
<xml_diff>
--- a/outputs/submitted/manuscrit_DM.docx
+++ b/outputs/submitted/manuscrit_DM.docx
@@ -224,7 +224,7 @@
         <w:footnoteReference w:id="12"/>
       </w:r>
       <w:r>
-        <w:t xml:space="preserve">. Pourtant, à l’échelle du budget des ménages, la vente directe ne pèse presque rien — de l’ordre de quelques pour cent de la dépense alimentaire à domicile (Kneafsey et al., 2013). Ce contraste entre une adhésion large et un poids économique faible est le point de départ de cet article.</w:t>
+        <w:t xml:space="preserve">. Le phénomène s’est d’ailleurs installé du côté de l’offre : en 2020, près d’une exploitation agricole française sur quatre commercialisait en circuit court (Agreste, 2023). Pourtant, à l’échelle du budget des ménages, la vente directe ne pèse presque rien — une part modeste de la dépense alimentaire (Enthoven et Van den Broeck, 2021). Ce contraste entre une adhésion large et un poids économique faible est le point de départ de cet article.</w:t>
       </w:r>
     </w:p>
     <w:p>
@@ -438,7 +438,7 @@
         <w:pStyle w:val="FirstParagraph"/>
       </w:pPr>
       <w:r>
-        <w:t xml:space="preserve">En France, la définition administrative des circuits courts retient la présence d’au plus un intermédiaire entre le producteur et le consommateur (Ministère de l’Agriculture et de l’Alimentation, 2009). La vente directe en est le sous-ensemble le plus strict — l’achat sans intermédiaire — et recouvre une pluralité de dispositifs : vente à la ferme, marchés où le producteur vend lui-même, magasins de producteurs, associations pour le maintien d’une agriculture paysanne (AMAP), paniers en précommande (Chiffoleau, 2019 ; Maréchal, 2008). Tous partagent une même caractéristique : la relation directe au producteur, porteuse d’un supplément de sens et d’information sur le produit (Dubuisson-Quellier et al., 2011 ; Lamine et Perrot, 2008). À l’échelle européenne, l’état des lieux socio-économique de Kneafsey et al. (2013) souligne l’hétérogénéité de ces dispositifs et, surtout, la faiblesse persistante des données représentatives sur leur diffusion réelle auprès des ménages — un déficit que la présente enquête vise à combler. La littérature sur les réseaux alimentaires alternatifs insiste par ailleurs sur la</w:t>
+        <w:t xml:space="preserve">En France, la définition administrative des circuits courts retient la présence d’au plus un intermédiaire entre le producteur et le consommateur (Ministère de l’Agriculture et de l’Alimentation, 2009). La vente directe en est le sous-ensemble le plus strict — l’achat sans intermédiaire — et recouvre une pluralité de dispositifs : vente à la ferme, marchés où le producteur vend lui-même, magasins de producteurs, associations pour le maintien d’une agriculture paysanne (AMAP), paniers en précommande (Chiffoleau, 2019 ; Maréchal, 2008). Tous partagent une même caractéristique : la relation directe au producteur, porteuse d’un supplément de sens et d’information sur le produit (Dubuisson-Quellier et al., 2011 ; Lamine et Perrot, 2008). La revue de Enthoven et Van den Broeck (2021), qui synthétise deux décennies de recherche sur les systèmes alimentaires locaux, souligne l’hétérogénéité de ces dispositifs et, surtout, la faiblesse persistante des données représentatives sur leur diffusion réelle auprès des ménages — un déficit que la présente enquête vise à combler. La littérature sur les réseaux alimentaires alternatifs insiste par ailleurs sur la</w:t>
       </w:r>
       <w:r>
         <w:t xml:space="preserve"> </w:t>
@@ -962,7 +962,7 @@
               <w:pStyle w:val="Compact"/>
             </w:pPr>
             <w:r>
-              <w:t xml:space="preserve">Kneafsey et al. (2013) ; Chiffoleau (2019) ; Praly et al. (2014)</w:t>
+              <w:t xml:space="preserve">Enthoven et Van den Broeck (2021) ; Chiffoleau (2019) ; Agreste (2023)</w:t>
             </w:r>
           </w:p>
         </w:tc>
@@ -3988,6 +3988,27 @@
         <w:pStyle w:val="FirstParagraph"/>
       </w:pPr>
       <w:r>
+        <w:t xml:space="preserve">Agreste (2023), Près d’une exploitation sur quatre vend en circuit court,</w:t>
+      </w:r>
+      <w:r>
+        <w:t xml:space="preserve"> </w:t>
+      </w:r>
+      <w:r>
+        <w:rPr>
+          <w:i/>
+          <w:iCs/>
+        </w:rPr>
+        <w:t xml:space="preserve">Agreste Primeur</w:t>
+      </w:r>
+      <w:r>
+        <w:t xml:space="preserve">, n°2023-5 (Recensement agricole 2020), Ministère de l’Agriculture.</w:t>
+      </w:r>
+    </w:p>
+    <w:p>
+      <w:pPr>
+        <w:pStyle w:val="BodyText"/>
+      </w:pPr>
+      <w:r>
         <w:t xml:space="preserve">Birch D., Memery J. et De Silva Kanakaratne M. (2018), The mindful consumer: balancing egoistic and altruistic motivations to purchase local food,</w:t>
       </w:r>
       <w:r>
@@ -4072,6 +4093,27 @@
         <w:pStyle w:val="BodyText"/>
       </w:pPr>
       <w:r>
+        <w:t xml:space="preserve">Enthoven L. et Van den Broeck G. (2021), Local food systems: reviewing two decades of research,</w:t>
+      </w:r>
+      <w:r>
+        <w:t xml:space="preserve"> </w:t>
+      </w:r>
+      <w:r>
+        <w:rPr>
+          <w:i/>
+          <w:iCs/>
+        </w:rPr>
+        <w:t xml:space="preserve">Agricultural Systems</w:t>
+      </w:r>
+      <w:r>
+        <w:t xml:space="preserve">, 193: 103226.</w:t>
+      </w:r>
+    </w:p>
+    <w:p>
+      <w:pPr>
+        <w:pStyle w:val="BodyText"/>
+      </w:pPr>
+      <w:r>
         <w:t xml:space="preserve">Feldmann C. et Hamm U. (2015), Consumers’ perceptions and preferences for local food: a review,</w:t>
       </w:r>
       <w:r>
@@ -4191,27 +4233,6 @@
       </w:r>
       <w:r>
         <w:t xml:space="preserve">, 13(1): 1-40.</w:t>
-      </w:r>
-    </w:p>
-    <w:p>
-      <w:pPr>
-        <w:pStyle w:val="BodyText"/>
-      </w:pPr>
-      <w:r>
-        <w:t xml:space="preserve">Kneafsey M., Venn L., Schmutz U. et al. (2013),</w:t>
-      </w:r>
-      <w:r>
-        <w:t xml:space="preserve"> </w:t>
-      </w:r>
-      <w:r>
-        <w:rPr>
-          <w:i/>
-          <w:iCs/>
-        </w:rPr>
-        <w:t xml:space="preserve">Short food supply chains and local food systems in the EU: a state of play of their socio-economic characteristics</w:t>
-      </w:r>
-      <w:r>
-        <w:t xml:space="preserve">, Luxembourg, Commission européenne (JRC Scientific and Policy Reports).</w:t>
       </w:r>
     </w:p>
     <w:p>
@@ -4483,7 +4504,7 @@
         <w:t xml:space="preserve"> </w:t>
       </w:r>
       <w:r>
-        <w:t xml:space="preserve">Sources professionnelles et institutionnelles (FranceAgriMer, Agreste, Commission européenne) convergentes sur ce point ; voir Kneafsey et al. (2013) pour une synthèse socio-économique européenne.</w:t>
+        <w:t xml:space="preserve">Sources professionnelles et institutionnelles (FranceAgriMer, Agreste) convergentes sur ce point ; voir Enthoven et Van den Broeck (2021) pour une synthèse récente de la recherche.</w:t>
       </w:r>
     </w:p>
   </w:footnote>

</xml_diff>

<commit_message>
DM revisions (author round 2): title 'adoptent', rename 5 strategies + channel counts, fix declarative framing, drop Mustapa WTP-vs-budget contrast, redesign Table3/Fig3 (4 modalities + conventional comparison), add diploma determinant (clusters + regression)
</commit_message>
<xml_diff>
--- a/outputs/submitted/manuscrit_DM.docx
+++ b/outputs/submitted/manuscrit_DM.docx
@@ -2,13 +2,13 @@
 <file path=word/document.xml><?xml version="1.0" encoding="utf-8"?>
 <w:document xmlns:w="http://schemas.openxmlformats.org/wordprocessingml/2006/main" xmlns:m="http://schemas.openxmlformats.org/officeDocument/2006/math" xmlns:r="http://schemas.openxmlformats.org/officeDocument/2006/relationships" xmlns:o="urn:schemas-microsoft-com:office:office" xmlns:v="urn:schemas-microsoft-com:vml" xmlns:w10="urn:schemas-microsoft-com:office:word" xmlns:a="http://schemas.openxmlformats.org/drawingml/2006/main" xmlns:pic="http://schemas.openxmlformats.org/drawingml/2006/picture" xmlns:wp="http://schemas.openxmlformats.org/drawingml/2006/wordprocessingDrawing">
   <w:body>
-    <w:bookmarkStart w:id="44" w:name="beaucoup-lessaient-peu-linstallent"/>
+    <w:bookmarkStart w:id="44" w:name="beaucoup-lessaient-peu-ladoptent"/>
     <w:p>
       <w:pPr>
         <w:pStyle w:val="Heading1"/>
       </w:pPr>
       <w:r>
-        <w:t xml:space="preserve">« Beaucoup l’essaient, peu l’installent »</w:t>
+        <w:t xml:space="preserve">« Beaucoup l’essaient, peu l’adoptent »</w:t>
       </w:r>
     </w:p>
     <w:bookmarkStart w:id="9" w:name="X567026fb20d909d7ed1876f1ed63bc3f882a5f2"/>
@@ -100,7 +100,7 @@
         <w:t xml:space="preserve"> </w:t>
       </w:r>
       <w:r>
-        <w:t xml:space="preserve">La vente directe présente un paradoxe : elle touche 65 % des ménages mais ne pèse que 1,5 % du budget alimentaire national (8,5 % chez ses seuls acheteurs réguliers). Elle est largement essayée mais peu retenue — 46 % des ménages qui déclarent l’utiliser n’ont rien acheté au cours du mois écoulé, et l’abandon atteint 65 % pour les AMAP. Cinq stratégies d’approvisionnement se distinguent, des « captifs de la grande distribution » aux « omnivores engagés ». Le recours à la vente directe est enfin faiblement déterminé par le profil sociodémographique : il traverse les catégories sociales.</w:t>
+        <w:t xml:space="preserve">La vente directe présente un paradoxe : elle touche 65 % des ménages mais ne pèse que 1,5 % du budget alimentaire national (8,5 % chez ses seuls acheteurs réguliers). Elle est largement essayée mais peu retenue — 46 % des ménages qui déclarent l’utiliser n’ont rien acheté au cours du mois écoulé, et l’abandon atteint 65 % pour les AMAP. Cinq stratégies d’approvisionnement se distinguent, des « captifs de la grande distribution » aux « multi-canal intensifs ». Le recours à la vente directe est enfin faiblement déterminé par le profil sociodémographique : il traverse les catégories sociales.</w:t>
       </w:r>
     </w:p>
     <w:p>
@@ -136,7 +136,7 @@
         <w:t xml:space="preserve"> </w:t>
       </w:r>
       <w:r>
-        <w:t xml:space="preserve">L’article importe le cadre du comportement omnicanal dans l’étude des circuits courts et segmente les ménages sur leur allocation réelle de budget, et non sur des attitudes déclarées, éclairant ainsi l’écart entre intention et comportement.</w:t>
+        <w:t xml:space="preserve">L’article importe le cadre du comportement omnicanal dans l’étude des circuits courts et segmente les ménages sur leurs pratiques d’achat déclarées (allocation de budget, fréquence, récence), et non sur leurs seules attitudes, éclairant ainsi l’écart entre intention et comportement.</w:t>
       </w:r>
     </w:p>
     <w:p>
@@ -369,7 +369,7 @@
         <w:t xml:space="preserve">méthodologique</w:t>
       </w:r>
       <w:r>
-        <w:t xml:space="preserve">, il quitte le registre</w:t>
+        <w:t xml:space="preserve">, il quitte le registre des</w:t>
       </w:r>
       <w:r>
         <w:t xml:space="preserve"> </w:t>
@@ -379,26 +379,29 @@
           <w:b/>
           <w:bCs/>
         </w:rPr>
-        <w:t xml:space="preserve">déclaratif</w:t>
+        <w:t xml:space="preserve">attitudes et intentions déclarées</w:t>
       </w:r>
       <w:r>
         <w:t xml:space="preserve"> </w:t>
       </w:r>
       <w:r>
-        <w:t xml:space="preserve">(attitudes, intentions, consentement à payer) pour mesurer l’</w:t>
+        <w:t xml:space="preserve">(dont le consentement à payer) pour mesurer les</w:t>
+      </w:r>
+      <w:r>
+        <w:t xml:space="preserve"> </w:t>
       </w:r>
       <w:r>
         <w:rPr>
           <w:b/>
           <w:bCs/>
         </w:rPr>
-        <w:t xml:space="preserve">allocation réelle de budget</w:t>
+        <w:t xml:space="preserve">pratiques d’achat déclarées</w:t>
       </w:r>
       <w:r>
         <w:t xml:space="preserve"> </w:t>
       </w:r>
       <w:r>
-        <w:t xml:space="preserve">entre canaux, sur données représentatives. Sur le plan</w:t>
+        <w:t xml:space="preserve">— fréquence, allocation de budget, récence —, sur données représentatives. Sur le plan</w:t>
       </w:r>
       <w:r>
         <w:t xml:space="preserve"> </w:t>
@@ -580,13 +583,13 @@
       </w:r>
     </w:p>
     <w:bookmarkEnd w:id="14"/>
-    <w:bookmarkStart w:id="15" w:name="X0fc29c39cd4034e9e2e723009385c757b96ef1d"/>
+    <w:bookmarkStart w:id="15" w:name="Xa78a6e9b4ec9f4ce7a7a5897be46e9029041738"/>
     <w:p>
       <w:pPr>
         <w:pStyle w:val="Heading3"/>
       </w:pPr>
       <w:r>
-        <w:t xml:space="preserve">De l’intention déclarée à l’allocation réelle</w:t>
+        <w:t xml:space="preserve">De l’intention déclarée aux pratiques d’achat</w:t>
       </w:r>
     </w:p>
     <w:p>
@@ -657,20 +660,23 @@
         <w:t xml:space="preserve"> </w:t>
       </w:r>
       <w:r>
-        <w:t xml:space="preserve">— soit des obstacles pratiques plus que financiers. Or la plupart de ces travaux mesurent des intentions, des attitudes ou un consentement à payer hypothétique, rarement des comportements d’achat effectifs. La méta-analyse de Mustapa et Kallas (2025) estime ainsi à +34,5 % la prime moyenne que les consommateurs se déclarent prêts à payer pour un produit de circuit court — un chiffre à confronter à la part de budget réellement consacrée. Le deuxième déplacement de l’article consiste précisément à quitter le registre déclaratif pour mesurer l’</w:t>
+        <w:t xml:space="preserve">— soit des obstacles pratiques plus que financiers. Or la plupart de ces travaux mesurent des intentions, des attitudes ou un consentement à payer hypothétique, rarement des comportements d’achat. La méta-analyse de Mustapa et Kallas (2025) montre ainsi que les consommateurs se déclarent prêts à payer une prime substantielle pour un produit de circuit court — une disposition dont rien ne garantit qu’elle se traduise dans les volumes achetés. Le deuxième déplacement de l’article consiste précisément à quitter le registre des attitudes et des intentions pour mesurer les</w:t>
+      </w:r>
+      <w:r>
+        <w:t xml:space="preserve"> </w:t>
       </w:r>
       <w:r>
         <w:rPr>
           <w:b/>
           <w:bCs/>
         </w:rPr>
-        <w:t xml:space="preserve">allocation budgétaire réelle</w:t>
+        <w:t xml:space="preserve">pratiques d’achat déclarées</w:t>
       </w:r>
       <w:r>
         <w:t xml:space="preserve"> </w:t>
       </w:r>
       <w:r>
-        <w:t xml:space="preserve">entre canaux : combien, concrètement, le ménage consacre-t-il à la vente directe, et non combien il dit vouloir y consacrer.</w:t>
+        <w:t xml:space="preserve">— fréquence de recours, allocation de budget, récence : combien, concrètement, le ménage déclare-t-il consacrer à la vente directe, et non combien il dit vouloir y consacrer. Nos données restent déclaratives, mais elles portent sur des comportements effectifs et non sur des dispositions.</w:t>
       </w:r>
     </w:p>
     <w:bookmarkEnd w:id="15"/>
@@ -736,7 +742,7 @@
         <w:t xml:space="preserve"> </w:t>
       </w:r>
       <w:r>
-        <w:t xml:space="preserve">et l’allocation réelle de budget qui en résulte : elle classe les ménages selon</w:t>
+        <w:t xml:space="preserve">et l’allocation de budget déclarée qui en résulte : elle classe les ménages selon</w:t>
       </w:r>
       <w:r>
         <w:t xml:space="preserve"> </w:t>
@@ -773,7 +779,7 @@
         <w:pStyle w:val="BodyText"/>
       </w:pPr>
       <w:r>
-        <w:t xml:space="preserve">Ce positionnement (Tableau 1) conduit à trois attentes, que l’analyse met à l’épreuve. D’abord, la vente directe occuperait rarement la place de canal principal : diffusion potentiellement large, mais part de budget faible (complémentarité, non substitution). Ensuite, sa pratique serait faiblement déterminée par le profil sociodémographique : elle traverserait les catégories. Enfin, conformément à l’écart attitude-comportement, l’adhésion déclarée serait nettement plus forte que le poids budgétaire effectif — beaucoup l’essaieraient, peu l’installeraient.</w:t>
+        <w:t xml:space="preserve">Ce positionnement (Tableau 1) conduit à trois attentes, que l’analyse met à l’épreuve. D’abord, la vente directe occuperait rarement la place de canal principal : diffusion potentiellement large, mais part de budget faible (complémentarité, non substitution). Ensuite, sa pratique serait faiblement déterminée par le profil sociodémographique : elle traverserait les catégories. Enfin, conformément à l’écart attitude-comportement, l’adhésion déclarée serait nettement plus forte que le poids budgétaire effectif — beaucoup l’essaieraient, peu l’adopteraient.</w:t>
       </w:r>
     </w:p>
     <w:p>
@@ -903,7 +909,7 @@
               <w:pStyle w:val="Compact"/>
             </w:pPr>
             <w:r>
-              <w:t xml:space="preserve">Du déclaratif à l’allocation budgétaire réelle</w:t>
+              <w:t xml:space="preserve">Des attitudes/intentions aux pratiques d’achat déclarées</w:t>
             </w:r>
           </w:p>
         </w:tc>
@@ -1850,7 +1856,7 @@
         <w:t xml:space="preserve"> </w:t>
       </w:r>
       <w:r>
-        <w:t xml:space="preserve">(près de 42 € par mois) : chez ses adeptes, elle n’a rien d’anecdotique. Un canal marginal à l’échelle du pays, mais installé dans le budget d’une minorité active.</w:t>
+        <w:t xml:space="preserve">(près de 42 € par mois) : chez ses adeptes, elle n’a rien d’anecdotique. Un canal marginal à l’échelle du pays, mais ancré dans le budget d’une minorité active.</w:t>
       </w:r>
     </w:p>
     <w:p>
@@ -1871,17 +1877,17 @@
         <w:t xml:space="preserve">complément ciblé</w:t>
       </w:r>
       <w:r>
-        <w:t xml:space="preserve">, mobilisé occasionnellement. C’est une manifestation nette de l’écart entre intention et comportement : alors que Mustapa et Kallas (2025) chiffrent à +34,5 % le surprix que les consommateurs se disent prêts à payer, la part réellement allouée reste marginale. La vente directe est, en somme, largement essayée mais rarement intensive.</w:t>
+        <w:t xml:space="preserve">, mobilisé occasionnellement. C’est une manifestation nette de l’écart entre les dispositions déclarées et les comportements d’achat : l’adhésion de principe est massive, la part de budget marginale. La vente directe est, en somme, largement essayée mais rarement intensive.</w:t>
       </w:r>
     </w:p>
     <w:bookmarkEnd w:id="25"/>
-    <w:bookmarkStart w:id="29" w:name="Xe5b250b76c2b938649582c3ae50d3dc9ec82d74"/>
+    <w:bookmarkStart w:id="29" w:name="Xe4e0b2f4b1568e238a2a23f481cbadf536e92a8"/>
     <w:p>
       <w:pPr>
         <w:pStyle w:val="Heading2"/>
       </w:pPr>
       <w:r>
-        <w:t xml:space="preserve">De l’essai à l’ancrage : un engagement peu retenu</w:t>
+        <w:t xml:space="preserve">De l’essai à l’adoption : une pratique peu retenue</w:t>
       </w:r>
     </w:p>
     <w:p>
@@ -1902,7 +1908,7 @@
         <w:t xml:space="preserve">récence d’achat</w:t>
       </w:r>
       <w:r>
-        <w:t xml:space="preserve">. Au-delà de la question générale de fréquentation, l’enquête demande, pour chaque forme de vente directe, si le ménage y a acheté</w:t>
+        <w:t xml:space="preserve">. Au-delà de la question générale de fréquentation, l’enquête demande, pour chaque forme de vente directe, si le ménage y a acheté au cours du mois écoulé, en distinguant quatre situations : un</w:t>
       </w:r>
       <w:r>
         <w:t xml:space="preserve"> </w:t>
@@ -1912,13 +1918,55 @@
           <w:b/>
           <w:bCs/>
         </w:rPr>
-        <w:t xml:space="preserve">au cours du mois écoulé</w:t>
+        <w:t xml:space="preserve">achat récent</w:t>
       </w:r>
       <w:r>
         <w:t xml:space="preserve"> </w:t>
       </w:r>
       <w:r>
-        <w:t xml:space="preserve">— distinguant l’acheteur actif de celui qui « achète encore, mais pas ce mois-ci », et de celui qui « en achetait, mais plus maintenant ». L’écart entre la fréquentation déclarée et cet achat récent est révélateur (Tableau 3, Figure 3).</w:t>
+        <w:t xml:space="preserve">(le mois écoulé), un</w:t>
+      </w:r>
+      <w:r>
+        <w:t xml:space="preserve"> </w:t>
+      </w:r>
+      <w:r>
+        <w:rPr>
+          <w:b/>
+          <w:bCs/>
+        </w:rPr>
+        <w:t xml:space="preserve">achat plus ancien mais toujours pratiqué</w:t>
+      </w:r>
+      <w:r>
+        <w:t xml:space="preserve">, un</w:t>
+      </w:r>
+      <w:r>
+        <w:t xml:space="preserve"> </w:t>
+      </w:r>
+      <w:r>
+        <w:rPr>
+          <w:b/>
+          <w:bCs/>
+        </w:rPr>
+        <w:t xml:space="preserve">achat abandonné</w:t>
+      </w:r>
+      <w:r>
+        <w:t xml:space="preserve"> </w:t>
+      </w:r>
+      <w:r>
+        <w:t xml:space="preserve">(« j’en achetais, mais ce n’est plus le cas ») et l’</w:t>
+      </w:r>
+      <w:r>
+        <w:rPr>
+          <w:b/>
+          <w:bCs/>
+        </w:rPr>
+        <w:t xml:space="preserve">absence d’achat</w:t>
+      </w:r>
+      <w:r>
+        <w:t xml:space="preserve"> </w:t>
+      </w:r>
+      <w:r>
+        <w:t xml:space="preserve">par cette forme. Pour situer ces formes, nous les comparons à trois circuits conventionnels spécialisés — le boulanger, le boucher, le primeur — soumis aux mêmes questions (Tableau 3, Figure 3).</w:t>
       </w:r>
     </w:p>
     <w:p>
@@ -1950,7 +1998,7 @@
         <w:pStyle w:val="BodyText"/>
       </w:pPr>
       <w:r>
-        <w:t xml:space="preserve">Surtout, la récence décroît fortement avec le degré d’engagement qu’exige la forme. Les formes conviviales et sans engagement — le marché — restent les plus ancrées : 62 % de ceux qui y ont déjà acheté au producteur l’ont fait le mois écoulé. À l’opposé, les formes les plus engageantes sont massivement</w:t>
+        <w:t xml:space="preserve">Surtout, la récence décroît fortement avec l’effort qu’exige la forme, et la comparaison conventionnelle le souligne. Les canaux du quotidien sont fortement ancrés : chez le boulanger, 58 % des clients ont acheté le mois écoulé ; sur le marché au producteur, 59 %. Mais dès que la forme demande une démarche spécifique, la récence s’effondre : 22 % pour les magasins de producteurs, 17 % pour les halles, 7 % pour les foires et salons, 6 % pour les paniers en ligne — ces derniers affichant même 66 % de « jamais » parmi les acheteurs directs interrogés. Le boucher et le primeur (37-38 %) se situent au niveau de l’achat à la ferme (34 %), signe que le clivage ne suit pas la frontière conventionnel/alternatif mais bien le</w:t>
       </w:r>
       <w:r>
         <w:t xml:space="preserve"> </w:t>
@@ -1960,13 +2008,13 @@
           <w:b/>
           <w:bCs/>
         </w:rPr>
-        <w:t xml:space="preserve">abandonnées</w:t>
+        <w:t xml:space="preserve">degré d’effort</w:t>
       </w:r>
       <w:r>
         <w:t xml:space="preserve"> </w:t>
       </w:r>
       <w:r>
-        <w:t xml:space="preserve">: parmi ceux qui les ont déjà essayées, 46 % ont cessé pour les paniers en ligne, 30 % pour les foires et salons, 27 % pour les halles. Le cas des AMAP est extrême : sur les ménages qui en ont un jour été clients,</w:t>
+        <w:t xml:space="preserve">requis. L’abandon culmine enfin sur les formes les plus engageantes : parmi les ménages qui ont un jour été clients d’une</w:t>
       </w:r>
       <w:r>
         <w:t xml:space="preserve"> </w:t>
@@ -1976,22 +2024,32 @@
           <w:b/>
           <w:bCs/>
         </w:rPr>
-        <w:t xml:space="preserve">près des deux tiers (65 %) ne le sont plus</w:t>
-      </w:r>
-      <w:r>
-        <w:t xml:space="preserve">.</w:t>
-      </w:r>
-    </w:p>
-    <w:p>
-      <w:pPr>
-        <w:pStyle w:val="BodyText"/>
-      </w:pPr>
+        <w:t xml:space="preserve">AMAP</w:t>
+      </w:r>
+      <w:r>
+        <w:t xml:space="preserve">, près des deux tiers (</w:t>
+      </w:r>
       <w:r>
         <w:rPr>
           <w:b/>
           <w:bCs/>
         </w:rPr>
-        <w:t xml:space="preserve">Tableau 3 : De l’essai à l’ancrage — récence d’achat par forme de vente directe</w:t>
+        <w:t xml:space="preserve">65 %</w:t>
+      </w:r>
+      <w:r>
+        <w:t xml:space="preserve">) ne le sont plus.</w:t>
+      </w:r>
+    </w:p>
+    <w:p>
+      <w:pPr>
+        <w:pStyle w:val="BodyText"/>
+      </w:pPr>
+      <w:r>
+        <w:rPr>
+          <w:b/>
+          <w:bCs/>
+        </w:rPr>
+        <w:t xml:space="preserve">Tableau 3 : Récence d’achat par forme de vente directe et comparaison conventionnelle</w:t>
       </w:r>
     </w:p>
     <w:tbl>
@@ -2044,7 +2102,7 @@
               <w:jc w:val="center"/>
             </w:pPr>
             <w:r>
-              <w:t xml:space="preserve">Ont déjà acheté (n)</w:t>
+              <w:t xml:space="preserve">Acheté le mois écoulé</w:t>
             </w:r>
           </w:p>
         </w:tc>
@@ -2056,7 +2114,7 @@
               <w:jc w:val="center"/>
             </w:pPr>
             <w:r>
-              <w:t xml:space="preserve">Achat le mois écoulé (% des essayeurs)</w:t>
+              <w:t xml:space="preserve">Achète, pas ce mois-ci</w:t>
             </w:r>
           </w:p>
         </w:tc>
@@ -2068,7 +2126,7 @@
               <w:jc w:val="center"/>
             </w:pPr>
             <w:r>
-              <w:t xml:space="preserve">Achat le mois écoulé (% des interrogés)</w:t>
+              <w:t xml:space="preserve">N’achète plus</w:t>
             </w:r>
           </w:p>
         </w:tc>
@@ -2080,7 +2138,7 @@
               <w:jc w:val="center"/>
             </w:pPr>
             <w:r>
-              <w:t xml:space="preserve">En achetaient, plus maintenant (% des essayeurs)</w:t>
+              <w:t xml:space="preserve">Jamais</w:t>
             </w:r>
           </w:p>
         </w:tc>
@@ -2117,30 +2175,6 @@
               <w:jc w:val="center"/>
             </w:pPr>
             <w:r>
-              <w:t xml:space="preserve">770</w:t>
-            </w:r>
-          </w:p>
-        </w:tc>
-        <w:tc>
-          <w:tcPr/>
-          <w:p>
-            <w:pPr>
-              <w:pStyle w:val="Compact"/>
-              <w:jc w:val="center"/>
-            </w:pPr>
-            <w:r>
-              <w:t xml:space="preserve">62 %</w:t>
-            </w:r>
-          </w:p>
-        </w:tc>
-        <w:tc>
-          <w:tcPr/>
-          <w:p>
-            <w:pPr>
-              <w:pStyle w:val="Compact"/>
-              <w:jc w:val="center"/>
-            </w:pPr>
-            <w:r>
               <w:t xml:space="preserve">59 %</w:t>
             </w:r>
           </w:p>
@@ -2153,7 +2187,280 @@
               <w:jc w:val="center"/>
             </w:pPr>
             <w:r>
+              <w:t xml:space="preserve">30 %</w:t>
+            </w:r>
+          </w:p>
+        </w:tc>
+        <w:tc>
+          <w:tcPr/>
+          <w:p>
+            <w:pPr>
+              <w:pStyle w:val="Compact"/>
+              <w:jc w:val="center"/>
+            </w:pPr>
+            <w:r>
               <w:t xml:space="preserve">6 %</w:t>
+            </w:r>
+          </w:p>
+        </w:tc>
+        <w:tc>
+          <w:tcPr/>
+          <w:p>
+            <w:pPr>
+              <w:pStyle w:val="Compact"/>
+              <w:jc w:val="center"/>
+            </w:pPr>
+            <w:r>
+              <w:t xml:space="preserve">5 %</w:t>
+            </w:r>
+          </w:p>
+        </w:tc>
+      </w:tr>
+      <w:tr>
+        <w:tc>
+          <w:tcPr/>
+          <w:p>
+            <w:pPr>
+              <w:pStyle w:val="Compact"/>
+            </w:pPr>
+            <w:r>
+              <w:t xml:space="preserve">Boulanger</w:t>
+            </w:r>
+            <w:r>
+              <w:t xml:space="preserve"> </w:t>
+            </w:r>
+            <w:r>
+              <w:rPr>
+                <w:i/>
+                <w:iCs/>
+              </w:rPr>
+              <w:t xml:space="preserve">(conv.)</w:t>
+            </w:r>
+          </w:p>
+        </w:tc>
+        <w:tc>
+          <w:tcPr/>
+          <w:p>
+            <w:pPr>
+              <w:pStyle w:val="Compact"/>
+              <w:jc w:val="center"/>
+            </w:pPr>
+            <w:r>
+              <w:t xml:space="preserve">893</w:t>
+            </w:r>
+          </w:p>
+        </w:tc>
+        <w:tc>
+          <w:tcPr/>
+          <w:p>
+            <w:pPr>
+              <w:pStyle w:val="Compact"/>
+              <w:jc w:val="center"/>
+            </w:pPr>
+            <w:r>
+              <w:t xml:space="preserve">58 %</w:t>
+            </w:r>
+          </w:p>
+        </w:tc>
+        <w:tc>
+          <w:tcPr/>
+          <w:p>
+            <w:pPr>
+              <w:pStyle w:val="Compact"/>
+              <w:jc w:val="center"/>
+            </w:pPr>
+            <w:r>
+              <w:t xml:space="preserve">21 %</w:t>
+            </w:r>
+          </w:p>
+        </w:tc>
+        <w:tc>
+          <w:tcPr/>
+          <w:p>
+            <w:pPr>
+              <w:pStyle w:val="Compact"/>
+              <w:jc w:val="center"/>
+            </w:pPr>
+            <w:r>
+              <w:t xml:space="preserve">10 %</w:t>
+            </w:r>
+          </w:p>
+        </w:tc>
+        <w:tc>
+          <w:tcPr/>
+          <w:p>
+            <w:pPr>
+              <w:pStyle w:val="Compact"/>
+              <w:jc w:val="center"/>
+            </w:pPr>
+            <w:r>
+              <w:t xml:space="preserve">11 %</w:t>
+            </w:r>
+          </w:p>
+        </w:tc>
+      </w:tr>
+      <w:tr>
+        <w:tc>
+          <w:tcPr/>
+          <w:p>
+            <w:pPr>
+              <w:pStyle w:val="Compact"/>
+            </w:pPr>
+            <w:r>
+              <w:t xml:space="preserve">Boucher</w:t>
+            </w:r>
+            <w:r>
+              <w:t xml:space="preserve"> </w:t>
+            </w:r>
+            <w:r>
+              <w:rPr>
+                <w:i/>
+                <w:iCs/>
+              </w:rPr>
+              <w:t xml:space="preserve">(conv.)</w:t>
+            </w:r>
+          </w:p>
+        </w:tc>
+        <w:tc>
+          <w:tcPr/>
+          <w:p>
+            <w:pPr>
+              <w:pStyle w:val="Compact"/>
+              <w:jc w:val="center"/>
+            </w:pPr>
+            <w:r>
+              <w:t xml:space="preserve">893</w:t>
+            </w:r>
+          </w:p>
+        </w:tc>
+        <w:tc>
+          <w:tcPr/>
+          <w:p>
+            <w:pPr>
+              <w:pStyle w:val="Compact"/>
+              <w:jc w:val="center"/>
+            </w:pPr>
+            <w:r>
+              <w:t xml:space="preserve">38 %</w:t>
+            </w:r>
+          </w:p>
+        </w:tc>
+        <w:tc>
+          <w:tcPr/>
+          <w:p>
+            <w:pPr>
+              <w:pStyle w:val="Compact"/>
+              <w:jc w:val="center"/>
+            </w:pPr>
+            <w:r>
+              <w:t xml:space="preserve">32 %</w:t>
+            </w:r>
+          </w:p>
+        </w:tc>
+        <w:tc>
+          <w:tcPr/>
+          <w:p>
+            <w:pPr>
+              <w:pStyle w:val="Compact"/>
+              <w:jc w:val="center"/>
+            </w:pPr>
+            <w:r>
+              <w:t xml:space="preserve">17 %</w:t>
+            </w:r>
+          </w:p>
+        </w:tc>
+        <w:tc>
+          <w:tcPr/>
+          <w:p>
+            <w:pPr>
+              <w:pStyle w:val="Compact"/>
+              <w:jc w:val="center"/>
+            </w:pPr>
+            <w:r>
+              <w:t xml:space="preserve">13 %</w:t>
+            </w:r>
+          </w:p>
+        </w:tc>
+      </w:tr>
+      <w:tr>
+        <w:tc>
+          <w:tcPr/>
+          <w:p>
+            <w:pPr>
+              <w:pStyle w:val="Compact"/>
+            </w:pPr>
+            <w:r>
+              <w:t xml:space="preserve">Primeur</w:t>
+            </w:r>
+            <w:r>
+              <w:t xml:space="preserve"> </w:t>
+            </w:r>
+            <w:r>
+              <w:rPr>
+                <w:i/>
+                <w:iCs/>
+              </w:rPr>
+              <w:t xml:space="preserve">(conv.)</w:t>
+            </w:r>
+          </w:p>
+        </w:tc>
+        <w:tc>
+          <w:tcPr/>
+          <w:p>
+            <w:pPr>
+              <w:pStyle w:val="Compact"/>
+              <w:jc w:val="center"/>
+            </w:pPr>
+            <w:r>
+              <w:t xml:space="preserve">893</w:t>
+            </w:r>
+          </w:p>
+        </w:tc>
+        <w:tc>
+          <w:tcPr/>
+          <w:p>
+            <w:pPr>
+              <w:pStyle w:val="Compact"/>
+              <w:jc w:val="center"/>
+            </w:pPr>
+            <w:r>
+              <w:t xml:space="preserve">37 %</w:t>
+            </w:r>
+          </w:p>
+        </w:tc>
+        <w:tc>
+          <w:tcPr/>
+          <w:p>
+            <w:pPr>
+              <w:pStyle w:val="Compact"/>
+              <w:jc w:val="center"/>
+            </w:pPr>
+            <w:r>
+              <w:t xml:space="preserve">34 %</w:t>
+            </w:r>
+          </w:p>
+        </w:tc>
+        <w:tc>
+          <w:tcPr/>
+          <w:p>
+            <w:pPr>
+              <w:pStyle w:val="Compact"/>
+              <w:jc w:val="center"/>
+            </w:pPr>
+            <w:r>
+              <w:t xml:space="preserve">17 %</w:t>
+            </w:r>
+          </w:p>
+        </w:tc>
+        <w:tc>
+          <w:tcPr/>
+          <w:p>
+            <w:pPr>
+              <w:pStyle w:val="Compact"/>
+              <w:jc w:val="center"/>
+            </w:pPr>
+            <w:r>
+              <w:t xml:space="preserve">13 %</w:t>
             </w:r>
           </w:p>
         </w:tc>
@@ -2190,30 +2497,6 @@
               <w:jc w:val="center"/>
             </w:pPr>
             <w:r>
-              <w:t xml:space="preserve">433</w:t>
-            </w:r>
-          </w:p>
-        </w:tc>
-        <w:tc>
-          <w:tcPr/>
-          <w:p>
-            <w:pPr>
-              <w:pStyle w:val="Compact"/>
-              <w:jc w:val="center"/>
-            </w:pPr>
-            <w:r>
-              <w:t xml:space="preserve">40 %</w:t>
-            </w:r>
-          </w:p>
-        </w:tc>
-        <w:tc>
-          <w:tcPr/>
-          <w:p>
-            <w:pPr>
-              <w:pStyle w:val="Compact"/>
-              <w:jc w:val="center"/>
-            </w:pPr>
-            <w:r>
               <w:t xml:space="preserve">34 %</w:t>
             </w:r>
           </w:p>
@@ -2226,7 +2509,31 @@
               <w:jc w:val="center"/>
             </w:pPr>
             <w:r>
-              <w:t xml:space="preserve">19 %</w:t>
+              <w:t xml:space="preserve">35 %</w:t>
+            </w:r>
+          </w:p>
+        </w:tc>
+        <w:tc>
+          <w:tcPr/>
+          <w:p>
+            <w:pPr>
+              <w:pStyle w:val="Compact"/>
+              <w:jc w:val="center"/>
+            </w:pPr>
+            <w:r>
+              <w:t xml:space="preserve">16 %</w:t>
+            </w:r>
+          </w:p>
+        </w:tc>
+        <w:tc>
+          <w:tcPr/>
+          <w:p>
+            <w:pPr>
+              <w:pStyle w:val="Compact"/>
+              <w:jc w:val="center"/>
+            </w:pPr>
+            <w:r>
+              <w:t xml:space="preserve">15 %</w:t>
             </w:r>
           </w:p>
         </w:tc>
@@ -2251,43 +2558,7 @@
               <w:jc w:val="center"/>
             </w:pPr>
             <w:r>
-              <w:t xml:space="preserve">509</w:t>
-            </w:r>
-          </w:p>
-        </w:tc>
-        <w:tc>
-          <w:tcPr/>
-          <w:p>
-            <w:pPr>
-              <w:pStyle w:val="Compact"/>
-              <w:jc w:val="center"/>
-            </w:pPr>
-            <w:r>
-              <w:t xml:space="preserve">351</w:t>
-            </w:r>
-          </w:p>
-        </w:tc>
-        <w:tc>
-          <w:tcPr/>
-          <w:p>
-            <w:pPr>
-              <w:pStyle w:val="Compact"/>
-              <w:jc w:val="center"/>
-            </w:pPr>
-            <w:r>
-              <w:t xml:space="preserve">29 %</w:t>
-            </w:r>
-          </w:p>
-        </w:tc>
-        <w:tc>
-          <w:tcPr/>
-          <w:p>
-            <w:pPr>
-              <w:pStyle w:val="Compact"/>
-              <w:jc w:val="center"/>
-            </w:pPr>
-            <w:r>
-              <w:t xml:space="preserve">20 %</w:t>
+              <w:t xml:space="preserve">469</w:t>
             </w:r>
           </w:p>
         </w:tc>
@@ -2300,6 +2571,42 @@
             </w:pPr>
             <w:r>
               <w:t xml:space="preserve">22 %</w:t>
+            </w:r>
+          </w:p>
+        </w:tc>
+        <w:tc>
+          <w:tcPr/>
+          <w:p>
+            <w:pPr>
+              <w:pStyle w:val="Compact"/>
+              <w:jc w:val="center"/>
+            </w:pPr>
+            <w:r>
+              <w:t xml:space="preserve">37 %</w:t>
+            </w:r>
+          </w:p>
+        </w:tc>
+        <w:tc>
+          <w:tcPr/>
+          <w:p>
+            <w:pPr>
+              <w:pStyle w:val="Compact"/>
+              <w:jc w:val="center"/>
+            </w:pPr>
+            <w:r>
+              <w:t xml:space="preserve">17 %</w:t>
+            </w:r>
+          </w:p>
+        </w:tc>
+        <w:tc>
+          <w:tcPr/>
+          <w:p>
+            <w:pPr>
+              <w:pStyle w:val="Compact"/>
+              <w:jc w:val="center"/>
+            </w:pPr>
+            <w:r>
+              <w:t xml:space="preserve">25 %</w:t>
             </w:r>
           </w:p>
         </w:tc>
@@ -2336,7 +2643,7 @@
               <w:jc w:val="center"/>
             </w:pPr>
             <w:r>
-              <w:t xml:space="preserve">359</w:t>
+              <w:t xml:space="preserve">17 %</w:t>
             </w:r>
           </w:p>
         </w:tc>
@@ -2348,7 +2655,7 @@
               <w:jc w:val="center"/>
             </w:pPr>
             <w:r>
-              <w:t xml:space="preserve">23 %</w:t>
+              <w:t xml:space="preserve">35 %</w:t>
             </w:r>
           </w:p>
         </w:tc>
@@ -2360,7 +2667,7 @@
               <w:jc w:val="center"/>
             </w:pPr>
             <w:r>
-              <w:t xml:space="preserve">16 %</w:t>
+              <w:t xml:space="preserve">19 %</w:t>
             </w:r>
           </w:p>
         </w:tc>
@@ -2372,80 +2679,7 @@
               <w:jc w:val="center"/>
             </w:pPr>
             <w:r>
-              <w:t xml:space="preserve">27 %</w:t>
-            </w:r>
-          </w:p>
-        </w:tc>
-      </w:tr>
-      <w:tr>
-        <w:tc>
-          <w:tcPr/>
-          <w:p>
-            <w:pPr>
-              <w:pStyle w:val="Compact"/>
-            </w:pPr>
-            <w:r>
-              <w:t xml:space="preserve">Panier en ligne (La Ruche…)</w:t>
-            </w:r>
-          </w:p>
-        </w:tc>
-        <w:tc>
-          <w:tcPr/>
-          <w:p>
-            <w:pPr>
-              <w:pStyle w:val="Compact"/>
-              <w:jc w:val="center"/>
-            </w:pPr>
-            <w:r>
-              <w:t xml:space="preserve">509</w:t>
-            </w:r>
-          </w:p>
-        </w:tc>
-        <w:tc>
-          <w:tcPr/>
-          <w:p>
-            <w:pPr>
-              <w:pStyle w:val="Compact"/>
-              <w:jc w:val="center"/>
-            </w:pPr>
-            <w:r>
-              <w:t xml:space="preserve">155</w:t>
-            </w:r>
-          </w:p>
-        </w:tc>
-        <w:tc>
-          <w:tcPr/>
-          <w:p>
-            <w:pPr>
-              <w:pStyle w:val="Compact"/>
-              <w:jc w:val="center"/>
-            </w:pPr>
-            <w:r>
-              <w:t xml:space="preserve">18 %</w:t>
-            </w:r>
-          </w:p>
-        </w:tc>
-        <w:tc>
-          <w:tcPr/>
-          <w:p>
-            <w:pPr>
-              <w:pStyle w:val="Compact"/>
-              <w:jc w:val="center"/>
-            </w:pPr>
-            <w:r>
-              <w:t xml:space="preserve">6 %</w:t>
-            </w:r>
-          </w:p>
-        </w:tc>
-        <w:tc>
-          <w:tcPr/>
-          <w:p>
-            <w:pPr>
-              <w:pStyle w:val="Compact"/>
-              <w:jc w:val="center"/>
-            </w:pPr>
-            <w:r>
-              <w:t xml:space="preserve">46 %</w:t>
+              <w:t xml:space="preserve">29 %</w:t>
             </w:r>
           </w:p>
         </w:tc>
@@ -2482,30 +2716,6 @@
               <w:jc w:val="center"/>
             </w:pPr>
             <w:r>
-              <w:t xml:space="preserve">297</w:t>
-            </w:r>
-          </w:p>
-        </w:tc>
-        <w:tc>
-          <w:tcPr/>
-          <w:p>
-            <w:pPr>
-              <w:pStyle w:val="Compact"/>
-              <w:jc w:val="center"/>
-            </w:pPr>
-            <w:r>
-              <w:t xml:space="preserve">11 %</w:t>
-            </w:r>
-          </w:p>
-        </w:tc>
-        <w:tc>
-          <w:tcPr/>
-          <w:p>
-            <w:pPr>
-              <w:pStyle w:val="Compact"/>
-              <w:jc w:val="center"/>
-            </w:pPr>
-            <w:r>
               <w:t xml:space="preserve">7 %</w:t>
             </w:r>
           </w:p>
@@ -2518,7 +2728,31 @@
               <w:jc w:val="center"/>
             </w:pPr>
             <w:r>
-              <w:t xml:space="preserve">30 %</w:t>
+              <w:t xml:space="preserve">34 %</w:t>
+            </w:r>
+          </w:p>
+        </w:tc>
+        <w:tc>
+          <w:tcPr/>
+          <w:p>
+            <w:pPr>
+              <w:pStyle w:val="Compact"/>
+              <w:jc w:val="center"/>
+            </w:pPr>
+            <w:r>
+              <w:t xml:space="preserve">18 %</w:t>
+            </w:r>
+          </w:p>
+        </w:tc>
+        <w:tc>
+          <w:tcPr/>
+          <w:p>
+            <w:pPr>
+              <w:pStyle w:val="Compact"/>
+              <w:jc w:val="center"/>
+            </w:pPr>
+            <w:r>
+              <w:t xml:space="preserve">42 %</w:t>
             </w:r>
           </w:p>
         </w:tc>
@@ -2531,7 +2765,7 @@
               <w:pStyle w:val="Compact"/>
             </w:pPr>
             <w:r>
-              <w:t xml:space="preserve">AMAP*</w:t>
+              <w:t xml:space="preserve">Panier en ligne (La Ruche…)</w:t>
             </w:r>
           </w:p>
         </w:tc>
@@ -2543,7 +2777,7 @@
               <w:jc w:val="center"/>
             </w:pPr>
             <w:r>
-              <w:t xml:space="preserve">509</w:t>
+              <w:t xml:space="preserve">456</w:t>
             </w:r>
           </w:p>
         </w:tc>
@@ -2555,7 +2789,7 @@
               <w:jc w:val="center"/>
             </w:pPr>
             <w:r>
-              <w:t xml:space="preserve">116</w:t>
+              <w:t xml:space="preserve">6 %</w:t>
             </w:r>
           </w:p>
         </w:tc>
@@ -2567,7 +2801,7 @@
               <w:jc w:val="center"/>
             </w:pPr>
             <w:r>
-              <w:t xml:space="preserve">35 %</w:t>
+              <w:t xml:space="preserve">12 %</w:t>
             </w:r>
           </w:p>
         </w:tc>
@@ -2579,7 +2813,7 @@
               <w:jc w:val="center"/>
             </w:pPr>
             <w:r>
-              <w:t xml:space="preserve">8 %</w:t>
+              <w:t xml:space="preserve">16 %</w:t>
             </w:r>
           </w:p>
         </w:tc>
@@ -2591,7 +2825,7 @@
               <w:jc w:val="center"/>
             </w:pPr>
             <w:r>
-              <w:t xml:space="preserve">65 %</w:t>
+              <w:t xml:space="preserve">66 %</w:t>
             </w:r>
           </w:p>
         </w:tc>
@@ -2606,7 +2840,7 @@
           <w:i/>
           <w:iCs/>
         </w:rPr>
-        <w:t xml:space="preserve">Base « interrogés » : chalands de marché (810) pour le marché ; acheteurs en vente directe aux agriculteurs (509) pour les autres formes. *AMAP : codage sans référence au mois écoulé (adhérent actuel vs ancien) ; « % des essayeurs » = adhérents actuels parmi les adhérents actuels et anciens ; « en achetaient, plus maintenant » = anciens adhérents.</w:t>
+        <w:t xml:space="preserve">Base : personnes interrogées sur chaque forme, en % ligne (hors rares « ne sait pas »). Les circuits en italique (boulanger, boucher, primeur) sont des comparateurs conventionnels spécialisés. L’AMAP est traitée à part (questionnaire sans référence au mois écoulé) : 35 % d’adhérents actuels contre 65 % d’anciens adhérents.</w:t>
       </w:r>
     </w:p>
     <w:p>
@@ -2616,7 +2850,7 @@
       <w:r>
         <w:drawing>
           <wp:inline>
-            <wp:extent cx="5969000" cy="2573970"/>
+            <wp:extent cx="5969000" cy="2990492"/>
             <wp:effectExtent b="0" l="0" r="0" t="0"/>
             <wp:docPr descr="Figure 3" title="" id="27" name="Picture"/>
             <a:graphic>
@@ -2637,7 +2871,7 @@
                   <pic:spPr bwMode="auto">
                     <a:xfrm>
                       <a:off x="0" y="0"/>
-                      <a:ext cx="5969000" cy="2573970"/>
+                      <a:ext cx="5969000" cy="2990492"/>
                     </a:xfrm>
                     <a:prstGeom prst="rect">
                       <a:avLst/>
@@ -2673,7 +2907,7 @@
           <w:b/>
           <w:bCs/>
         </w:rPr>
-        <w:t xml:space="preserve">Figure 3 : De l’essai à l’ancrage — récence d’achat par forme de vente directe</w:t>
+        <w:t xml:space="preserve">Figure 3 : Récence d’achat par forme (vente directe et circuits conventionnels spécialisés)</w:t>
       </w:r>
     </w:p>
     <w:p>
@@ -2691,7 +2925,7 @@
           <w:b/>
           <w:bCs/>
         </w:rPr>
-        <w:t xml:space="preserve">largement essayée, mais son usage peine à s’installer</w:t>
+        <w:t xml:space="preserve">largement essayée, mais son usage peine à s’ancrer</w:t>
       </w:r>
       <w:r>
         <w:t xml:space="preserve"> </w:t>
@@ -2818,12 +3052,13 @@
         <w:tblLook w:firstRow="1" w:lastRow="0" w:firstColumn="0" w:lastColumn="0" w:noHBand="0" w:noVBand="0" w:val="0020"/>
       </w:tblPr>
       <w:tblGrid>
-        <w:gridCol w:w="1193"/>
-        <w:gridCol w:w="650"/>
-        <w:gridCol w:w="1518"/>
-        <w:gridCol w:w="1627"/>
-        <w:gridCol w:w="1735"/>
-        <w:gridCol w:w="1193"/>
+        <w:gridCol w:w="1116"/>
+        <w:gridCol w:w="609"/>
+        <w:gridCol w:w="507"/>
+        <w:gridCol w:w="1421"/>
+        <w:gridCol w:w="1523"/>
+        <w:gridCol w:w="1624"/>
+        <w:gridCol w:w="1116"/>
       </w:tblGrid>
       <w:tr>
         <w:trPr>
@@ -2848,6 +3083,18 @@
             </w:pPr>
             <w:r>
               <w:t xml:space="preserve">Part</w:t>
+            </w:r>
+          </w:p>
+        </w:tc>
+        <w:tc>
+          <w:tcPr/>
+          <w:p>
+            <w:pPr>
+              <w:pStyle w:val="Compact"/>
+              <w:jc w:val="center"/>
+            </w:pPr>
+            <w:r>
+              <w:t xml:space="preserve">Canaux (fréq. / rég.)</w:t>
             </w:r>
           </w:p>
         </w:tc>
@@ -2904,7 +3151,7 @@
               <w:pStyle w:val="Compact"/>
             </w:pPr>
             <w:r>
-              <w:t xml:space="preserve">Généralistes</w:t>
+              <w:t xml:space="preserve">Multi-canal modérés</w:t>
             </w:r>
           </w:p>
         </w:tc>
@@ -2916,6 +3163,18 @@
             </w:pPr>
             <w:r>
               <w:t xml:space="preserve">61 %</w:t>
+            </w:r>
+          </w:p>
+        </w:tc>
+        <w:tc>
+          <w:tcPr/>
+          <w:p>
+            <w:pPr>
+              <w:pStyle w:val="Compact"/>
+              <w:jc w:val="center"/>
+            </w:pPr>
+            <w:r>
+              <w:t xml:space="preserve">7,2 / 3,8</w:t>
             </w:r>
           </w:p>
         </w:tc>
@@ -2992,6 +3251,18 @@
           <w:p>
             <w:pPr>
               <w:pStyle w:val="Compact"/>
+              <w:jc w:val="center"/>
+            </w:pPr>
+            <w:r>
+              <w:t xml:space="preserve">3,8 / 2,8</w:t>
+            </w:r>
+          </w:p>
+        </w:tc>
+        <w:tc>
+          <w:tcPr/>
+          <w:p>
+            <w:pPr>
+              <w:pStyle w:val="Compact"/>
             </w:pPr>
             <w:r>
               <w:t xml:space="preserve">408 €</w:t>
@@ -3040,7 +3311,7 @@
               <w:pStyle w:val="Compact"/>
             </w:pPr>
             <w:r>
-              <w:t xml:space="preserve">Omnivores engagés</w:t>
+              <w:t xml:space="preserve">Multi-canal intensifs</w:t>
             </w:r>
           </w:p>
         </w:tc>
@@ -3052,6 +3323,18 @@
             </w:pPr>
             <w:r>
               <w:t xml:space="preserve">8 %</w:t>
+            </w:r>
+          </w:p>
+        </w:tc>
+        <w:tc>
+          <w:tcPr/>
+          <w:p>
+            <w:pPr>
+              <w:pStyle w:val="Compact"/>
+              <w:jc w:val="center"/>
+            </w:pPr>
+            <w:r>
+              <w:t xml:space="preserve">11,1 / 9,5</w:t>
             </w:r>
           </w:p>
         </w:tc>
@@ -3108,7 +3391,7 @@
               <w:pStyle w:val="Compact"/>
             </w:pPr>
             <w:r>
-              <w:t xml:space="preserve">Multi-canal conventionnels</w:t>
+              <w:t xml:space="preserve">Explorateurs conventionnels</w:t>
             </w:r>
           </w:p>
         </w:tc>
@@ -3120,6 +3403,18 @@
             </w:pPr>
             <w:r>
               <w:t xml:space="preserve">5 %</w:t>
+            </w:r>
+          </w:p>
+        </w:tc>
+        <w:tc>
+          <w:tcPr/>
+          <w:p>
+            <w:pPr>
+              <w:pStyle w:val="Compact"/>
+              <w:jc w:val="center"/>
+            </w:pPr>
+            <w:r>
+              <w:t xml:space="preserve">11,0 / 6,1</w:t>
             </w:r>
           </w:p>
         </w:tc>
@@ -3163,7 +3458,7 @@
               <w:pStyle w:val="Compact"/>
             </w:pPr>
             <w:r>
-              <w:t xml:space="preserve">Essaient tout, panier régulier conventionnel</w:t>
+              <w:t xml:space="preserve">Essaient tout, cœur régulier conventionnel</w:t>
             </w:r>
           </w:p>
         </w:tc>
@@ -3176,7 +3471,7 @@
               <w:pStyle w:val="Compact"/>
             </w:pPr>
             <w:r>
-              <w:t xml:space="preserve">Hors-hypermarché</w:t>
+              <w:t xml:space="preserve">Adeptes de la proximité</w:t>
             </w:r>
           </w:p>
         </w:tc>
@@ -3188,6 +3483,18 @@
             </w:pPr>
             <w:r>
               <w:t xml:space="preserve">2,5 %</w:t>
+            </w:r>
+          </w:p>
+        </w:tc>
+        <w:tc>
+          <w:tcPr/>
+          <w:p>
+            <w:pPr>
+              <w:pStyle w:val="Compact"/>
+              <w:jc w:val="center"/>
+            </w:pPr>
+            <w:r>
+              <w:t xml:space="preserve">6,3 / 3,3</w:t>
             </w:r>
           </w:p>
         </w:tc>
@@ -3242,6 +3549,18 @@
         <w:pStyle w:val="BodyText"/>
       </w:pPr>
       <w:r>
+        <w:rPr>
+          <w:i/>
+          <w:iCs/>
+        </w:rPr>
+        <w:t xml:space="preserve">« Canaux (fréq. / rég.) » : nombre moyen de canaux fréquentés / utilisés régulièrement (sur 13).</w:t>
+      </w:r>
+    </w:p>
+    <w:p>
+      <w:pPr>
+        <w:pStyle w:val="BodyText"/>
+      </w:pPr>
+      <w:r>
         <w:t xml:space="preserve">Les</w:t>
       </w:r>
       <w:r>
@@ -3252,7 +3571,7 @@
           <w:b/>
           <w:bCs/>
         </w:rPr>
-        <w:t xml:space="preserve">généralistes</w:t>
+        <w:t xml:space="preserve">multi-canal modérés</w:t>
       </w:r>
       <w:r>
         <w:t xml:space="preserve"> </w:t>
@@ -3284,7 +3603,7 @@
           <w:b/>
           <w:bCs/>
         </w:rPr>
-        <w:t xml:space="preserve">omnivores engagés</w:t>
+        <w:t xml:space="preserve">multi-canal intensifs</w:t>
       </w:r>
       <w:r>
         <w:t xml:space="preserve"> </w:t>
@@ -3300,7 +3619,7 @@
           <w:b/>
           <w:bCs/>
         </w:rPr>
-        <w:t xml:space="preserve">multi-canal conventionnels</w:t>
+        <w:t xml:space="preserve">explorateurs conventionnels</w:t>
       </w:r>
       <w:r>
         <w:t xml:space="preserve"> </w:t>
@@ -3316,7 +3635,7 @@
           <w:b/>
           <w:bCs/>
         </w:rPr>
-        <w:t xml:space="preserve">hors-hypermarché</w:t>
+        <w:t xml:space="preserve">adeptes de la proximité</w:t>
       </w:r>
       <w:r>
         <w:t xml:space="preserve"> </w:t>
@@ -3356,13 +3675,13 @@
           <w:b/>
           <w:bCs/>
         </w:rPr>
-        <w:t xml:space="preserve">usage installé</w:t>
+        <w:t xml:space="preserve">usage adopté</w:t>
       </w:r>
       <w:r>
         <w:t xml:space="preserve"> </w:t>
       </w:r>
       <w:r>
-        <w:t xml:space="preserve">— qu’illustre l’écart entre vente directe inclusive et régulière — structure l’ensemble : le taux inclusif de vente directe croît avec l’ampleur du répertoire de canaux (de 28 % chez les captifs à 100 % chez les multi-canal conventionnels), mais l’usage régulier ne culmine que chez les omnivores engagés (67 %), montrant que largeur du répertoire et intensité d’engagement ne se confondent pas. Le second est que ce n’est pas le profil social qui prédit le mieux la vente directe, mais la</w:t>
+        <w:t xml:space="preserve">— qu’illustre l’écart entre vente directe inclusive et régulière — structure l’ensemble : le taux inclusif de vente directe croît avec l’ampleur du répertoire de canaux (de 28 % chez les captifs à 100 % chez les explorateurs conventionnels), mais l’usage régulier ne culmine que chez les multi-canal intensifs (67 %), montrant que largeur du répertoire et intensité d’engagement ne se confondent pas. Le second est que ce n’est pas le profil social qui prédit le mieux la vente directe, mais la</w:t>
       </w:r>
       <w:r>
         <w:t xml:space="preserve"> </w:t>
@@ -3378,7 +3697,7 @@
         <w:t xml:space="preserve"> </w:t>
       </w:r>
       <w:r>
-        <w:t xml:space="preserve">— la stratégie d’approvisionnement — dans laquelle elle s’inscrit : les omnivores l’installent dans une routine multi-canal dense, les captifs s’en tiennent à distance, les multi-canal conventionnels l’essaient sans la pérenniser. Cette grille de segmentation par les pratiques est directement actionnable, car chaque configuration appelle un levier différent.</w:t>
+        <w:t xml:space="preserve">— la stratégie d’approvisionnement — dans laquelle elle s’inscrit : les multi-canal intensifs l’ancrent dans une routine multi-canal dense, les captifs s’en tiennent à distance, les explorateurs conventionnels l’essaient sans la pérenniser. Cette grille de segmentation par les pratiques est directement actionnable, car chaque configuration appelle un levier différent.</w:t>
       </w:r>
     </w:p>
     <w:bookmarkEnd w:id="33"/>
@@ -3396,7 +3715,23 @@
         <w:pStyle w:val="FirstParagraph"/>
       </w:pPr>
       <w:r>
-        <w:t xml:space="preserve">Les cinq stratégies diffèrent significativement par la catégorie socioprofessionnelle (p &lt; 0,001) et par l’âge (p = 0,005). Les omnivores engagés et les multi-canal conventionnels sur-représentent les cadres et les professions intermédiaires et disposent des budgets les plus élevés ; les captifs de la grande distribution et les généralistes reflètent davantage la structure moyenne de la population ; le groupe hors-hypermarché se distingue par sa part élevée de retraités et son budget réduit. Ces écarts, réels, restent toutefois modestes au regard de la dispersion interne des classes.</w:t>
+        <w:t xml:space="preserve">Les cinq stratégies diffèrent significativement par la catégorie socioprofessionnelle (p &lt; 0,001), par le</w:t>
+      </w:r>
+      <w:r>
+        <w:t xml:space="preserve"> </w:t>
+      </w:r>
+      <w:r>
+        <w:rPr>
+          <w:b/>
+          <w:bCs/>
+        </w:rPr>
+        <w:t xml:space="preserve">diplôme</w:t>
+      </w:r>
+      <w:r>
+        <w:t xml:space="preserve"> </w:t>
+      </w:r>
+      <w:r>
+        <w:t xml:space="preserve">(p &lt; 0,001) et par l’âge (p = 0,005). Les multi-canal intensifs et les explorateurs conventionnels sont nettement les plus diplômés — 42 à 43 % de bac+3 ou plus, contre seulement 4 à 11 % de non-bacheliers — et disposent des budgets les plus élevés ; les captifs de la grande distribution sont à l’inverse les moins diplômés (un tiers sans le bac) ; les multi-canal modérés reflètent la structure moyenne ; le groupe adeptes de la proximité se distingue par sa part élevée de retraités et son budget réduit. Ces écarts, réels, restent toutefois modestes au regard de la dispersion interne des classes.</w:t>
       </w:r>
     </w:p>
     <w:p>
@@ -3404,7 +3739,33 @@
         <w:pStyle w:val="BodyText"/>
       </w:pPr>
       <w:r>
-        <w:t xml:space="preserve">La régression logistique du recours à la vente directe (Figure 5) le confirme : le modèle explique très peu de sa variance (pseudo-R² de McFadden = 0,022). Deux effets seulement ressortent nettement : appartenir aux cadres et professions libérales multiplie par 2,16 les chances de pratiquer la vente directe (p = 0,003), et un budget alimentaire élevé l’accroît modérément (odds-ratio = 1,18 par écart-type, p = 0,028) ; les professions intermédiaires sont également au-dessus de la référence (odds-ratio = 1,60, p = 0,027). En revanche, le sexe, l’âge et la taille d’agglomération n’ont pas d’effet significatif.</w:t>
+        <w:t xml:space="preserve">La régression logistique du recours à la vente directe (Figure 5) le confirme : même en intégrant le diplôme, le modèle explique très peu de sa variance (pseudo-R² de McFadden = 0,029). Le déterminant le plus net est le</w:t>
+      </w:r>
+      <w:r>
+        <w:t xml:space="preserve"> </w:t>
+      </w:r>
+      <w:r>
+        <w:rPr>
+          <w:b/>
+          <w:bCs/>
+        </w:rPr>
+        <w:t xml:space="preserve">niveau de diplôme</w:t>
+      </w:r>
+      <w:r>
+        <w:t xml:space="preserve"> </w:t>
+      </w:r>
+      <w:r>
+        <w:t xml:space="preserve">: détenir un diplôme de niveau bac+3 ou plus multiplie par 1,89 les chances de pratiquer la vente directe (p = 0,003). Un budget alimentaire élevé joue également, modérément (odds-ratio = 1,17 par écart-type, p = 0,042). Fait notable, une fois le diplôme pris en compte, l’effet de la catégorie « cadres » s’estompe (odds-ratio = 1,64, p = 0,07, non significatif) : c’est donc l’</w:t>
+      </w:r>
+      <w:r>
+        <w:rPr>
+          <w:b/>
+          <w:bCs/>
+        </w:rPr>
+        <w:t xml:space="preserve">éducation</w:t>
+      </w:r>
+      <w:r>
+        <w:t xml:space="preserve">, plus que la position socioprofessionnelle, qui constitue le principal gradient social. Le sexe, l’âge et la taille d’agglomération restent sans effet significatif.</w:t>
       </w:r>
     </w:p>
     <w:p>
@@ -3414,7 +3775,7 @@
       <w:r>
         <w:drawing>
           <wp:inline>
-            <wp:extent cx="5969000" cy="4243199"/>
+            <wp:extent cx="5969000" cy="4901190"/>
             <wp:effectExtent b="0" l="0" r="0" t="0"/>
             <wp:docPr descr="Figure 5" title="" id="35" name="Picture"/>
             <a:graphic>
@@ -3435,7 +3796,7 @@
                   <pic:spPr bwMode="auto">
                     <a:xfrm>
                       <a:off x="0" y="0"/>
-                      <a:ext cx="5969000" cy="4243199"/>
+                      <a:ext cx="5969000" cy="4901190"/>
                     </a:xfrm>
                     <a:prstGeom prst="rect">
                       <a:avLst/>
@@ -3479,7 +3840,7 @@
         <w:pStyle w:val="BodyText"/>
       </w:pPr>
       <w:r>
-        <w:t xml:space="preserve">La faiblesse de ce pouvoir explicatif est en soi un résultat : la vente directe n’est pas le marqueur d’un groupe social circonscrit. Si les cadres y recourent un peu plus, l’essentiel de la pratique se distribue transversalement — comme l’illustre l’existence du groupe hors-hypermarché à budget modeste. Ce constat converge avec Herzig et Zander (2025), pour qui les variables sociodémographiques expliquent finalement peu le comportement d’achat en circuit court.</w:t>
+        <w:t xml:space="preserve">La faiblesse de ce pouvoir explicatif est en soi un résultat : la vente directe n’est pas le marqueur d’un groupe social circonscrit. Si les plus diplômés y recourent un peu plus, l’essentiel de la pratique se distribue transversalement — comme l’illustre l’existence du groupe adeptes de la proximité, plus âgé et à budget modeste. Ce constat converge avec Herzig et Zander (2025), pour qui les variables sociodémographiques expliquent finalement peu le comportement d’achat en circuit court.</w:t>
       </w:r>
     </w:p>
     <w:p>
@@ -3606,7 +3967,7 @@
         <w:t xml:space="preserve"> </w:t>
       </w:r>
       <w:r>
-        <w:t xml:space="preserve">Le potentiel de conquête est largement atteint : 65 % des ménages ont déjà acheté en direct, mais seuls 17 % le font régulièrement, et un seul groupe sur cinq — les omnivores engagés — a vraiment installé la pratique. Le gisement de croissance se situe donc chez les quelque 48 % de ménages qui achètent en direct</w:t>
+        <w:t xml:space="preserve">Le potentiel de conquête est largement atteint : 65 % des ménages ont déjà acheté en direct, mais seuls 17 % le font régulièrement, et un seul groupe sur cinq — les multi-canal intensifs — a vraiment adopté la pratique. Le gisement de croissance se situe donc chez les quelque 48 % de ménages qui achètent en direct</w:t>
       </w:r>
       <w:r>
         <w:t xml:space="preserve"> </w:t>
@@ -3700,7 +4061,7 @@
         <w:t xml:space="preserve"> </w:t>
       </w:r>
       <w:r>
-        <w:t xml:space="preserve">La vente directe n’étant pas socialement clivante — le modèle sociodémographique n’explique que 2 % de la variance de la pratique —, il n’y a pas lieu de la réserver, dans les représentations comme dans le ciblage marketing, à un segment aisé et urbain. Les dispositifs peuvent viser tous les publics, y compris les budgets modestes : le profil hors-hypermarché, plus âgé et moins doté, montre qu’un approvisionnement de proximité à petit budget est non seulement possible mais déjà pratiqué. Ce constat plaide contre une segmentation par le revenu ou la CSP, et pour une segmentation par la</w:t>
+        <w:t xml:space="preserve">La vente directe restant faiblement déterminée socialement — le modèle n’explique que 3 % de la variance de la pratique, avec pour seul gradient net un léger sur-recours des plus diplômés —, il n’y a pas lieu de la réserver, dans les représentations comme dans le ciblage marketing, à un segment aisé et urbain. Les dispositifs peuvent viser tous les publics, y compris les budgets modestes : le profil adeptes de la proximité, plus âgé et moins doté, montre qu’un approvisionnement de proximité à petit budget est non seulement possible mais déjà pratiqué. Ce constat plaide contre une segmentation par le revenu ou la CSP, et pour une segmentation par la</w:t>
       </w:r>
       <w:r>
         <w:t xml:space="preserve"> </w:t>
@@ -3716,7 +4077,7 @@
         <w:t xml:space="preserve"> </w:t>
       </w:r>
       <w:r>
-        <w:t xml:space="preserve">: c’est la configuration d’usage (généraliste, captif, omnivore…), et non la position sociale, qui prédit le recours à la vente directe et indique le levier pertinent.</w:t>
+        <w:t xml:space="preserve">: c’est la configuration d’usage (multi-canal modérés, captifs, intensifs…), et non la position sociale, qui prédit le recours à la vente directe et indique le levier pertinent.</w:t>
       </w:r>
     </w:p>
     <w:p>
@@ -3813,7 +4174,7 @@
         <w:t xml:space="preserve"> </w:t>
       </w:r>
       <w:r>
-        <w:t xml:space="preserve">— horaires, proximité, régularité de l’offre : c’est là que se joue le passage à l’usage installé, non dans la sensibilisation.</w:t>
+        <w:t xml:space="preserve">— horaires, proximité, régularité de l’offre : c’est là que se joue le passage à l’usage adopté, non dans la sensibilisation.</w:t>
       </w:r>
     </w:p>
     <w:p>
@@ -3914,7 +4275,7 @@
         <w:t xml:space="preserve"> </w:t>
       </w:r>
       <w:r>
-        <w:t xml:space="preserve">: les fréquences et surtout les parts de budget reposent sur l’estimation des répondants, sujette à des biais de mémoire et de désirabilité sociale — la sur-déclaration probable des comportements valorisés socialement renforce d’ailleurs le contraste que nous relevons avec le faible poids budgétaire effectif. La part directe des achats réalisés sur les marchés n’étant pas isolable du budget « marché », le poids budgétaire total de la vente directe est en outre légèrement sous-estimé. Enfin, la plus petite classe (hors-hypermarché) appelle la prudence dans l’interprétation de ses caractéristiques fines, et les motivations n’ont été analysées que pour le canal des marchés.</w:t>
+        <w:t xml:space="preserve">: les fréquences et surtout les parts de budget reposent sur l’estimation des répondants, sujette à des biais de mémoire et de désirabilité sociale — la sur-déclaration probable des comportements valorisés socialement renforce d’ailleurs le contraste que nous relevons avec le faible poids budgétaire effectif. La part directe des achats réalisés sur les marchés n’étant pas isolable du budget « marché », le poids budgétaire total de la vente directe est en outre légèrement sous-estimé. Enfin, la plus petite classe (adeptes de la proximité) appelle la prudence dans l’interprétation de ses caractéristiques fines, et les motivations n’ont été analysées que pour le canal des marchés.</w:t>
       </w:r>
     </w:p>
     <w:p>
@@ -3964,7 +4325,7 @@
           <w:b/>
           <w:bCs/>
         </w:rPr>
-        <w:t xml:space="preserve">usage installé</w:t>
+        <w:t xml:space="preserve">usage adopté</w:t>
       </w:r>
       <w:r>
         <w:t xml:space="preserve"> </w:t>

</xml_diff>

<commit_message>
Table3/Fig3: unify base to 509 for all direct forms (fold 'ne connaît pas' into last category), add notoriety finding (46% don't know AMAP)
</commit_message>
<xml_diff>
--- a/outputs/submitted/manuscrit_DM.docx
+++ b/outputs/submitted/manuscrit_DM.docx
@@ -1998,7 +1998,7 @@
         <w:pStyle w:val="BodyText"/>
       </w:pPr>
       <w:r>
-        <w:t xml:space="preserve">Surtout, la récence décroît fortement avec l’effort qu’exige la forme, et la comparaison conventionnelle le souligne. Les canaux du quotidien sont fortement ancrés : chez le boulanger, 58 % des clients ont acheté le mois écoulé ; sur le marché au producteur, 59 %. Mais dès que la forme demande une démarche spécifique, la récence s’effondre : 22 % pour les magasins de producteurs, 17 % pour les halles, 7 % pour les foires et salons, 6 % pour les paniers en ligne — ces derniers affichant même 66 % de « jamais » parmi les acheteurs directs interrogés. Le boucher et le primeur (37-38 %) se situent au niveau de l’achat à la ferme (34 %), signe que le clivage ne suit pas la frontière conventionnel/alternatif mais bien le</w:t>
+        <w:t xml:space="preserve">Surtout, la récence décroît fortement avec l’effort qu’exige la forme, et la comparaison conventionnelle le souligne. Les canaux du quotidien sont fortement ancrés : chez le boulanger, 58 % des clients ont acheté le mois écoulé ; sur le marché au producteur, 59 %. Mais dès que la forme demande une démarche spécifique, la récence s’effondre : 20 % pour les magasins de producteurs, 17 % pour les halles, 7 % pour les foires et salons, 6 % pour les paniers en ligne. Le boucher et le primeur (37-38 %) se situent au niveau de l’achat à la ferme (34 %), signe que le clivage ne suit pas la frontière conventionnel/alternatif mais bien le</w:t>
       </w:r>
       <w:r>
         <w:t xml:space="preserve"> </w:t>
@@ -2014,7 +2014,7 @@
         <w:t xml:space="preserve"> </w:t>
       </w:r>
       <w:r>
-        <w:t xml:space="preserve">requis. L’abandon culmine enfin sur les formes les plus engageantes : parmi les ménages qui ont un jour été clients d’une</w:t>
+        <w:t xml:space="preserve">requis. Deux mécanismes se conjuguent. D’abord un déficit de</w:t>
       </w:r>
       <w:r>
         <w:t xml:space="preserve"> </w:t>
@@ -2024,10 +2024,42 @@
           <w:b/>
           <w:bCs/>
         </w:rPr>
-        <w:t xml:space="preserve">AMAP</w:t>
-      </w:r>
-      <w:r>
-        <w:t xml:space="preserve">, près des deux tiers (</w:t>
+        <w:t xml:space="preserve">notoriété</w:t>
+      </w:r>
+      <w:r>
+        <w:t xml:space="preserve"> </w:t>
+      </w:r>
+      <w:r>
+        <w:t xml:space="preserve">des formes les plus institutionnelles : parmi les acheteurs directs eux-mêmes, 8 % ignorent ce qu’est un magasin de producteurs, 10 % ce qu’est un panier en ligne de type La Ruche, et jusqu’à</w:t>
+      </w:r>
+      <w:r>
+        <w:t xml:space="preserve"> </w:t>
+      </w:r>
+      <w:r>
+        <w:rPr>
+          <w:b/>
+          <w:bCs/>
+        </w:rPr>
+        <w:t xml:space="preserve">46 % ce qu’est une AMAP</w:t>
+      </w:r>
+      <w:r>
+        <w:t xml:space="preserve">. Ensuite un fort</w:t>
+      </w:r>
+      <w:r>
+        <w:t xml:space="preserve"> </w:t>
+      </w:r>
+      <w:r>
+        <w:rPr>
+          <w:b/>
+          <w:bCs/>
+        </w:rPr>
+        <w:t xml:space="preserve">abandon</w:t>
+      </w:r>
+      <w:r>
+        <w:t xml:space="preserve"> </w:t>
+      </w:r>
+      <w:r>
+        <w:t xml:space="preserve">: parmi les ménages qui ont un jour été clients d’une AMAP, près des deux tiers (</w:t>
       </w:r>
       <w:r>
         <w:rPr>
@@ -2138,7 +2170,7 @@
               <w:jc w:val="center"/>
             </w:pPr>
             <w:r>
-              <w:t xml:space="preserve">Jamais</w:t>
+              <w:t xml:space="preserve">Jamais / ne connaît pas</w:t>
             </w:r>
           </w:p>
         </w:tc>
@@ -2558,7 +2590,7 @@
               <w:jc w:val="center"/>
             </w:pPr>
             <w:r>
-              <w:t xml:space="preserve">469</w:t>
+              <w:t xml:space="preserve">509</w:t>
             </w:r>
           </w:p>
         </w:tc>
@@ -2570,7 +2602,7 @@
               <w:jc w:val="center"/>
             </w:pPr>
             <w:r>
-              <w:t xml:space="preserve">22 %</w:t>
+              <w:t xml:space="preserve">20 %</w:t>
             </w:r>
           </w:p>
         </w:tc>
@@ -2582,7 +2614,7 @@
               <w:jc w:val="center"/>
             </w:pPr>
             <w:r>
-              <w:t xml:space="preserve">37 %</w:t>
+              <w:t xml:space="preserve">34 %</w:t>
             </w:r>
           </w:p>
         </w:tc>
@@ -2594,7 +2626,7 @@
               <w:jc w:val="center"/>
             </w:pPr>
             <w:r>
-              <w:t xml:space="preserve">17 %</w:t>
+              <w:t xml:space="preserve">15 %</w:t>
             </w:r>
           </w:p>
         </w:tc>
@@ -2606,7 +2638,7 @@
               <w:jc w:val="center"/>
             </w:pPr>
             <w:r>
-              <w:t xml:space="preserve">25 %</w:t>
+              <w:t xml:space="preserve">31 %</w:t>
             </w:r>
           </w:p>
         </w:tc>
@@ -2777,7 +2809,7 @@
               <w:jc w:val="center"/>
             </w:pPr>
             <w:r>
-              <w:t xml:space="preserve">456</w:t>
+              <w:t xml:space="preserve">509</w:t>
             </w:r>
           </w:p>
         </w:tc>
@@ -2801,7 +2833,7 @@
               <w:jc w:val="center"/>
             </w:pPr>
             <w:r>
-              <w:t xml:space="preserve">12 %</w:t>
+              <w:t xml:space="preserve">11 %</w:t>
             </w:r>
           </w:p>
         </w:tc>
@@ -2813,7 +2845,7 @@
               <w:jc w:val="center"/>
             </w:pPr>
             <w:r>
-              <w:t xml:space="preserve">16 %</w:t>
+              <w:t xml:space="preserve">14 %</w:t>
             </w:r>
           </w:p>
         </w:tc>
@@ -2825,7 +2857,7 @@
               <w:jc w:val="center"/>
             </w:pPr>
             <w:r>
-              <w:t xml:space="preserve">66 %</w:t>
+              <w:t xml:space="preserve">70 %</w:t>
             </w:r>
           </w:p>
         </w:tc>
@@ -2840,7 +2872,7 @@
           <w:i/>
           <w:iCs/>
         </w:rPr>
-        <w:t xml:space="preserve">Base : personnes interrogées sur chaque forme, en % ligne (hors rares « ne sait pas »). Les circuits en italique (boulanger, boucher, primeur) sont des comparateurs conventionnels spécialisés. L’AMAP est traitée à part (questionnaire sans référence au mois écoulé) : 35 % d’adhérents actuels contre 65 % d’anciens adhérents.</w:t>
+        <w:t xml:space="preserve">Base : personnes interrogées sur chaque forme, en % ligne. Les 509 ménages qui achètent en vente directe aux agriculteurs sont interrogés sur toutes les formes directes ; la dernière colonne réunit « jamais acheté » et, pour les formes les moins connues, « ne connaît pas cette forme » (8 % pour les magasins de producteurs, 10 % pour les paniers en ligne). Les circuits en italique (boulanger, boucher, primeur) sont des comparateurs conventionnels spécialisés (clients d’artisans, n = 893). L’AMAP est traitée à part (questionnaire sans référence au mois écoulé) : parmi ses clients passés ou présents, 35 % le sont encore, 65 % ont cessé.</w:t>
       </w:r>
     </w:p>
     <w:p>

</xml_diff>

<commit_message>
abstract + discussion: add education-gradient nuance (diploma > CSP, informational lever tied to awareness gap)
</commit_message>
<xml_diff>
--- a/outputs/submitted/manuscrit_DM.docx
+++ b/outputs/submitted/manuscrit_DM.docx
@@ -100,7 +100,7 @@
         <w:t xml:space="preserve"> </w:t>
       </w:r>
       <w:r>
-        <w:t xml:space="preserve">La vente directe présente un paradoxe : elle touche 65 % des ménages mais ne pèse que 1,5 % du budget alimentaire national (8,5 % chez ses seuls acheteurs réguliers). Elle est largement essayée mais peu retenue — 46 % des ménages qui déclarent l’utiliser n’ont rien acheté au cours du mois écoulé, et l’abandon atteint 65 % pour les AMAP. Cinq stratégies d’approvisionnement se distinguent, des « captifs de la grande distribution » aux « multi-canal intensifs ». Le recours à la vente directe est enfin faiblement déterminé par le profil sociodémographique : il traverse les catégories sociales.</w:t>
+        <w:t xml:space="preserve">La vente directe présente un paradoxe : elle touche 65 % des ménages mais ne pèse que 1,5 % du budget alimentaire national (8,5 % chez ses seuls acheteurs réguliers). Elle est largement essayée mais peu retenue — 46 % des ménages qui déclarent l’utiliser n’ont rien acheté au cours du mois écoulé, et l’abandon atteint 65 % pour les AMAP. Cinq stratégies d’approvisionnement se distinguent, des « captifs de la grande distribution » aux « multi-canal intensifs ». Le recours à la vente directe est enfin faiblement déterminé par le profil sociodémographique — il traverse les catégories sociales — le seul gradient net étant le diplôme (plus que la catégorie socioprofessionnelle).</w:t>
       </w:r>
     </w:p>
     <w:p>
@@ -4109,7 +4109,55 @@
         <w:t xml:space="preserve"> </w:t>
       </w:r>
       <w:r>
-        <w:t xml:space="preserve">: c’est la configuration d’usage (multi-canal modérés, captifs, intensifs…), et non la position sociale, qui prédit le recours à la vente directe et indique le levier pertinent.</w:t>
+        <w:t xml:space="preserve">: c’est la configuration d’usage (multi-canal modérés, captifs, intensifs…), et non la position sociale, qui prédit le recours à la vente directe et indique le levier pertinent. Que le seul gradient social net passe par le</w:t>
+      </w:r>
+      <w:r>
+        <w:t xml:space="preserve"> </w:t>
+      </w:r>
+      <w:r>
+        <w:rPr>
+          <w:b/>
+          <w:bCs/>
+        </w:rPr>
+        <w:t xml:space="preserve">diplôme</w:t>
+      </w:r>
+      <w:r>
+        <w:t xml:space="preserve"> </w:t>
+      </w:r>
+      <w:r>
+        <w:t xml:space="preserve">plutôt que par le revenu ou la catégorie socioprofessionnelle est d’ailleurs riche d’enseignement : il oriente vers un frein</w:t>
+      </w:r>
+      <w:r>
+        <w:t xml:space="preserve"> </w:t>
+      </w:r>
+      <w:r>
+        <w:rPr>
+          <w:b/>
+          <w:bCs/>
+        </w:rPr>
+        <w:t xml:space="preserve">informationnel et culturel</w:t>
+      </w:r>
+      <w:r>
+        <w:t xml:space="preserve"> </w:t>
+      </w:r>
+      <w:r>
+        <w:t xml:space="preserve">— savoir où trouver ces circuits, en comprendre le fonctionnement — davantage que financier. Le déficit de notoriété relevé plus haut, où près d’un acheteur direct sur deux ignore ce qu’est une AMAP, va dans le même sens. Le levier n’est donc pas de rendre la vente directe moins chère, mais plus</w:t>
+      </w:r>
+      <w:r>
+        <w:t xml:space="preserve"> </w:t>
+      </w:r>
+      <w:r>
+        <w:rPr>
+          <w:b/>
+          <w:bCs/>
+        </w:rPr>
+        <w:t xml:space="preserve">lisible et accessible</w:t>
+      </w:r>
+      <w:r>
+        <w:t xml:space="preserve"> </w:t>
+      </w:r>
+      <w:r>
+        <w:t xml:space="preserve">pour des publics aujourd’hui tenus à distance moins par le pouvoir d’achat que par l’information.</w:t>
       </w:r>
     </w:p>
     <w:p>
@@ -4228,7 +4276,7 @@
         <w:t xml:space="preserve"> </w:t>
       </w:r>
       <w:r>
-        <w:t xml:space="preserve">— la pratique traverse les catégories sociales ; les budgets modestes ne sont pas exclus.</w:t>
+        <w:t xml:space="preserve">— la pratique traverse les catégories sociales ; le seul gradient net est le diplôme, signe d’un frein informationnel (notoriété, lisibilité) plus que financier.</w:t>
       </w:r>
     </w:p>
     <w:p>

</xml_diff>

<commit_message>
Stade 3' : re-revue de vérification + retouches mineures
Contrôle du manuscrit révisé (et non de la seule lettre de réponse) :
12/12 points du 1er tour vérifiés RÉSOLUS. L'avocat du diable re-teste
ses trois attaques (paradoxe, typologie, essai/adoption) et les concède
toutes (5/4/5), aucune n'étant maintenue.

Décision révisée : acceptation sous réserve de modifications mineures
(rigueur méthodologique 5,5 -> 7,5). Quatre points résiduels mineurs
identifiés ; m1 (cohérence du discours sur le diplôme : gradient à
l'essai, pas à l'adoption) et m2 (projection de conversion qualifiée de
borne haute) appliqués au manuscrit ; m3 (budget de mots) et m4 (poids
de la petite classe) déjà couverts.

Livrable : reviews/re_revue_verification_DM.md (+ .docx). Manuscrit et
journaux mis à jour.

Co-Authored-By: Claude Opus 4.8 <noreply@anthropic.com>
Claude-Session: https://claude.ai/code/session_01GPMhaLyMn13E1D3y8GrY2W
</commit_message>
<xml_diff>
--- a/outputs/submitted/manuscrit_DM.docx
+++ b/outputs/submitted/manuscrit_DM.docx
@@ -4420,7 +4420,7 @@
         <w:t xml:space="preserve"> </w:t>
       </w:r>
       <w:r>
-        <w:t xml:space="preserve">— un quasi-triplement, hors de portée du seul recrutement, la pénétration étant déjà proche de son plafond. Le fort taux d’abandon des formes les plus engageantes — jusqu’à 65 % pour les AMAP — confirme que l’enjeu est bien la</w:t>
+        <w:t xml:space="preserve">— un quasi-triplement, hors de portée du seul recrutement, la pénétration étant déjà proche de son plafond. Cette projection est une borne haute (elle suppose que les convertis achètent aussi intensément que les réguliers d’aujourd’hui) ; elle vaut comme ordre de grandeur, non comme prévision. Le fort taux d’abandon des formes les plus engageantes — jusqu’à 65 % pour les AMAP — confirme que l’enjeu est bien la</w:t>
       </w:r>
       <w:r>
         <w:t xml:space="preserve"> </w:t>
@@ -4498,7 +4498,7 @@
         <w:t xml:space="preserve"> </w:t>
       </w:r>
       <w:r>
-        <w:t xml:space="preserve">La vente directe restant faiblement déterminée socialement — le modèle n’explique que 3 % de la variance de la pratique, avec pour seul gradient net un léger sur-recours des plus diplômés —, il n’y a pas lieu de la réserver, dans les représentations comme dans le ciblage marketing, à un segment aisé et urbain. Les dispositifs peuvent viser tous les publics, y compris les budgets modestes : le profil adeptes de la proximité, plus âgé et moins doté, montre qu’un approvisionnement de proximité à petit budget est non seulement possible mais déjà pratiqué. Ce constat plaide contre une segmentation par le revenu ou la CSP, et pour une segmentation par la</w:t>
+        <w:t xml:space="preserve">La vente directe restant faiblement déterminée socialement — le modèle n’explique que 3 % de la variance de la pratique, avec pour seul gradient net un léger sur-recours des plus diplômés, et encore à l’essai seulement, pas à l’adoption régulière —, il n’y a pas lieu de la réserver, dans les représentations comme dans le ciblage marketing, à un segment aisé et urbain. Les dispositifs peuvent viser tous les publics, y compris les budgets modestes : le profil adeptes de la proximité, plus âgé et moins doté, montre qu’un approvisionnement de proximité à petit budget est non seulement possible mais déjà pratiqué. Ce constat plaide contre une segmentation par le revenu ou la CSP, et pour une segmentation par la</w:t>
       </w:r>
       <w:r>
         <w:t xml:space="preserve"> </w:t>
@@ -4994,7 +4994,7 @@
         <w:t xml:space="preserve"> </w:t>
       </w:r>
       <w:r>
-        <w:t xml:space="preserve">— la pratique traverse les catégories sociales ; le seul gradient net est le diplôme, signe d’un frein informationnel (notoriété, lisibilité) plus que financier.</w:t>
+        <w:t xml:space="preserve">— la pratique traverse les catégories sociales ; le seul gradient net, et sur l’essai plus que sur l’adoption, est le diplôme, signe d’un frein informationnel (notoriété, lisibilité) plus que financier.</w:t>
       </w:r>
     </w:p>
     <w:p>

</xml_diff>

<commit_message>
Stade 4.5 : intégrité finale — PASS
Audit de traçabilité (code/11_audit_integrite.py) : 124/124 chiffres du
manuscrit recalculés depuis les données brutes, 0 écart. Intégrité
citations<->références : 22 références (<=35), aucune orpheline après
deux corrections (Chiffoleau et Dourian 2020 désormais citée ; note 1
renvoyée à Agreste et Enthoven et Van den Broeck, retrait de la mention
non référencée). Les 7 modes de défaillance de la recherche assistée par
IA sont franchis. Gouvernance RGPD confirmée : aucune donnée
individuelle suivie par git.

Verdict : PASS, finalisation autorisée. Manuscrit 7932 mots (< 8000).
Livrable : reviews/integrite_finale_DM.md (+ .docx).

Co-Authored-By: Claude Opus 4.8 <noreply@anthropic.com>
Claude-Session: https://claude.ai/code/session_01GPMhaLyMn13E1D3y8GrY2W
</commit_message>
<xml_diff>
--- a/outputs/submitted/manuscrit_DM.docx
+++ b/outputs/submitted/manuscrit_DM.docx
@@ -473,7 +473,7 @@
         <w:t xml:space="preserve"> </w:t>
       </w:r>
       <w:r>
-        <w:t xml:space="preserve">plutôt que la rupture entre circuits : loin de se substituer à la grande distribution, la vente directe s’y articule (Goodman et DuPuis, 2002 ; Sage, 2003).</w:t>
+        <w:t xml:space="preserve">plutôt que la rupture entre circuits : loin de se substituer à la grande distribution, la vente directe s’y articule (Goodman et DuPuis, 2002 ; Sage, 2003) — et raccourcir la chaîne n’est pas en soi une réponse suffisante (Chiffoleau et Dourian, 2020).</w:t>
       </w:r>
     </w:p>
     <w:p>
@@ -5663,7 +5663,7 @@
         <w:t xml:space="preserve"> </w:t>
       </w:r>
       <w:r>
-        <w:t xml:space="preserve">Sources professionnelles et institutionnelles (FranceAgriMer, Agreste) convergentes sur ce point ; voir Enthoven et Van den Broeck (2021) pour une synthèse récente de la recherche.</w:t>
+        <w:t xml:space="preserve">Sources institutionnelles et professionnelles convergentes sur ce point (voir Agreste, 2023) ; voir Enthoven et Van den Broeck (2021) pour une synthèse récente de la recherche.</w:t>
       </w:r>
     </w:p>
   </w:footnote>

</xml_diff>